<commit_message>
Overleaf project for the v3 paper; fix split paragraphs in the clean/Word copy; number main figures 1-4
Generated by scripts/build_v3_latex.py: main.tex, supplement.tex, references.bib (from saved registry records), figure PDFs, overleaf.zip.
Not compiled locally (no TeX engine); structure, citation keys and figure files checked.
The clean markdown stripped source-tag comments in a way that split paragraphs; comments alone on a line are now removed with their newline.
Main-text figures were numbered 1, 2, 5, 6 (3 and 4 are supplementary); they are now 1-4 in text and captions.

Co-Authored-By: Claude Sonnet 5.5 <noreply@anthropic.com>
</commit_message>
<xml_diff>
--- a/paper/v3_ismb/MANUSCRIPT.docx
+++ b/paper/v3_ismb/MANUSCRIPT.docx
@@ -79,11 +79,9 @@
       <w:r>
         <w:t xml:space="preserve">masking controls, with Holm correction over declared families.</w:t>
       </w:r>
-    </w:p>
-    <w:p>
-      <w:pPr>
-        <w:pStyle w:val="BodyText"/>
-      </w:pPr>
+      <w:r>
+        <w:t xml:space="preserve"> </w:t>
+      </w:r>
       <w:r>
         <w:t xml:space="preserve">In 11 of 22 model–dataset–level cells the three seeds fall on different sides of the uncorrected α = 0.05 threshold of their own</w:t>
       </w:r>
@@ -93,19 +91,15 @@
       <w:r>
         <w:t xml:space="preserve">verdict, and in 21 of 22 the seeds’ range exceeds the cell’s distance from chance.</w:t>
       </w:r>
-    </w:p>
-    <w:p>
-      <w:pPr>
-        <w:pStyle w:val="BodyText"/>
-      </w:pPr>
+      <w:r>
+        <w:t xml:space="preserve"> </w:t>
+      </w:r>
       <w:r>
         <w:t xml:space="preserve">After Holm correction (on the median p over seeds), 1 of 20 DAVIS cells supports residue-level recovery (HyperAttentionDTI, random split, 1.66× chance) and 0 of 8 KIBA cells do.</w:t>
       </w:r>
-    </w:p>
-    <w:p>
-      <w:pPr>
-        <w:pStyle w:val="BodyText"/>
-      </w:pPr>
+      <w:r>
+        <w:t xml:space="preserve"> </w:t>
+      </w:r>
       <w:r>
         <w:t xml:space="preserve">What replicates is coarser: masking the attended residues is load-bearing for three of the four models (not consistently for DrugBAN), and the ATP pocket is</w:t>
       </w:r>
@@ -115,11 +109,9 @@
       <w:r>
         <w:t xml:space="preserve">enriched in XAttn-Ref’s maps at every DAVIS level and HyperAttentionDTI’s at three of four (point estimates 1.33–2.10× chance; conservation not controlled).</w:t>
       </w:r>
-    </w:p>
-    <w:p>
-      <w:pPr>
-        <w:pStyle w:val="BodyText"/>
-      </w:pPr>
+      <w:r>
+        <w:t xml:space="preserve"> </w:t>
+      </w:r>
       <w:r>
         <w:t xml:space="preserve">DAVIS’s duplicated wild-type sequences inflate a DeepDTA baseline’s cold-target AUROC by 0.116 (p = 0.0013) on the leaked rows, but not</w:t>
       </w:r>
@@ -496,11 +488,9 @@
       <w:r>
         <w:t xml:space="preserve">and two on KIBA (random, unseen drug; DrugBAN is on DAVIS only); DeepDTA, which has no attention, anchors accuracy. The DAVIS arm has 60 cells and the KIBA arm 24.</w:t>
       </w:r>
-    </w:p>
-    <w:p>
-      <w:pPr>
-        <w:pStyle w:val="BodyText"/>
-      </w:pPr>
+      <w:r>
+        <w:t xml:space="preserve"> </w:t>
+      </w:r>
       <w:r>
         <w:t xml:space="preserve">Plausibility is precision@10 against UniProt’s annotated binding residues and against the KLIFS 85-residue ATP pocket, each read against its</w:t>
       </w:r>
@@ -570,11 +560,9 @@
       <w:r>
         <w:t xml:space="preserve">21 of the 22 the seeds’ range of precision@10 exceeds the cell’s distance from chance.</w:t>
       </w:r>
-    </w:p>
-    <w:p>
-      <w:pPr>
-        <w:pStyle w:val="BodyText"/>
-      </w:pPr>
+      <w:r>
+        <w:t xml:space="preserve"> </w:t>
+      </w:r>
       <w:r>
         <w:rPr>
           <w:b/>
@@ -600,11 +588,9 @@
       <w:r>
         <w:t xml:space="preserve">attention for three of the four models and enrichment of the ATP pocket.</w:t>
       </w:r>
-    </w:p>
-    <w:p>
-      <w:pPr>
-        <w:pStyle w:val="BodyText"/>
-      </w:pPr>
+      <w:r>
+        <w:t xml:space="preserve"> </w:t>
+      </w:r>
       <w:r>
         <w:rPr>
           <w:b/>
@@ -675,7 +661,7 @@
       </w:r>
     </w:p>
     <w:bookmarkEnd w:id="11"/>
-    <w:bookmarkStart w:id="19" w:name="methods"/>
+    <w:bookmarkStart w:id="18" w:name="methods"/>
     <w:p>
       <w:pPr>
         <w:pStyle w:val="Heading1"/>
@@ -706,11 +692,9 @@
       <w:r>
         <w:t xml:space="preserve">binary task: a pair is positive if pKd ≥ 7.0 on DAVIS or its KIBA score is ≥ 12.1, one constant shared by all trainers.</w:t>
       </w:r>
-    </w:p>
-    <w:p>
-      <w:pPr>
-        <w:pStyle w:val="BodyText"/>
-      </w:pPr>
+      <w:r>
+        <w:t xml:space="preserve"> </w:t>
+      </w:r>
       <w:r>
         <w:t xml:space="preserve">Each dataset is split at four levels of distribution shift: random; cold-drug, where test drugs are absent from training; cold-target, where test</w:t>
       </w:r>
@@ -756,11 +740,9 @@
       <w:r>
         <w:t xml:space="preserve">identical in sequence to a training target, and 10 targets hold too little of the kinase domain to contain its ATP pocket.</w:t>
       </w:r>
-    </w:p>
-    <w:p>
-      <w:pPr>
-        <w:pStyle w:val="BodyText"/>
-      </w:pPr>
+      <w:r>
+        <w:t xml:space="preserve"> </w:t>
+      </w:r>
       <w:r>
         <w:t xml:space="preserve">No model is retrained to correct this; the evaluation stops counting what it should not. Explanation metrics drop seen-by-sequence and</w:t>
       </w:r>
@@ -832,181 +814,159 @@
       <w:r>
         <w:t xml:space="preserve">early stopping after 15 epochs without improvement (10 for DeepDTA).</w:t>
       </w:r>
+      <w:r>
+        <w:t xml:space="preserve"> </w:t>
+      </w:r>
+      <w:r>
+        <w:t xml:space="preserve">DAVIS cells are trained in full precision. On KIBA, DeepDTA and HyperAttentionDTI use mixed precision, whereas MolTrans (whose hand-written layer</w:t>
+      </w:r>
+      <w:r>
+        <w:t xml:space="preserve"> </w:t>
+      </w:r>
+      <w:r>
+        <w:t xml:space="preserve">normalisation underflows in half precision) and XAttn-Ref use full precision; the precision of every cell is recorded in its results file. Mixed precision was checked beforehand on one DAVIS cell (HyperAttentionDTI, cold-pair, three seeds per arm), where test AUROC and precision@10 stayed within the full-precision seed spread; three seeds detect only a gross effect and cannot show equivalence (Supplement).</w:t>
+      </w:r>
+      <w:r>
+        <w:t xml:space="preserve"> </w:t>
+      </w:r>
+      <w:r>
+        <w:t xml:space="preserve">Plausibility is precision@k, the fraction of a protein’s k most-attended residues that are sites, with k = 10 fixed before any result existed. It is</w:t>
+      </w:r>
+      <w:r>
+        <w:t xml:space="preserve"> </w:t>
+      </w:r>
+      <w:r>
+        <w:t xml:space="preserve">computed on one test pair per protein, so that proteins measured against many drugs are not weighted by that count. Each protein’s chance level is</w:t>
+      </w:r>
+      <w:r>
+        <w:t xml:space="preserve"> </w:t>
+      </w:r>
+      <w:r>
+        <w:t xml:space="preserve">(sites in the window) ÷ (window length), the exact expectation for k uniformly random residues, and its ceiling is min(sites, k) ÷ k.</w:t>
+      </w:r>
+    </w:p>
+    <w:bookmarkEnd w:id="13"/>
+    <w:bookmarkStart w:id="14" w:name="the-calibrated-battery"/>
+    <w:p>
+      <w:pPr>
+        <w:pStyle w:val="Heading2"/>
+      </w:pPr>
+      <w:r>
+        <w:t xml:space="preserve">2.4 The calibrated battery</w:t>
+      </w:r>
+    </w:p>
+    <w:p>
+      <w:pPr>
+        <w:pStyle w:val="FirstParagraph"/>
+      </w:pPr>
+      <w:r>
+        <w:t xml:space="preserve">A verdict is read only against the following instruments, each implemented once and applied identically to every model it covers.</w:t>
+      </w:r>
     </w:p>
     <w:p>
       <w:pPr>
         <w:pStyle w:val="BodyText"/>
       </w:pPr>
-      <w:r>
-        <w:t xml:space="preserve">DAVIS cells are trained in full precision. On KIBA, DeepDTA and HyperAttentionDTI use mixed precision, whereas MolTrans (whose hand-written layer</w:t>
-      </w:r>
-      <w:r>
-        <w:t xml:space="preserve"> </w:t>
-      </w:r>
-      <w:r>
-        <w:t xml:space="preserve">normalisation underflows in half precision) and XAttn-Ref use full precision; the precision of every cell is recorded in its results file. Mixed precision was checked beforehand on one DAVIS cell (HyperAttentionDTI, cold-pair, three seeds per arm), where test AUROC and precision@10 stayed within the full-precision seed spread; three seeds detect only a gross effect and cannot show equivalence (Supplement).</w:t>
-      </w:r>
-      <w:r>
-        <w:t xml:space="preserve"> </w:t>
-      </w:r>
-      <w:r>
-        <w:t xml:space="preserve">DrugBAN is</w:t>
-      </w:r>
-      <w:r>
-        <w:t xml:space="preserve"> </w:t>
-      </w:r>
-      <w:r>
-        <w:t xml:space="preserve">trained on DAVIS only. Training ran on Kaggle sessions with two NVIDIA T4 GPUs, one independent job per GPU.</w:t>
-      </w:r>
-    </w:p>
-    <w:p>
-      <w:pPr>
-        <w:pStyle w:val="BodyText"/>
-      </w:pPr>
-      <w:r>
-        <w:t xml:space="preserve">The explanation scored for each model is the readout of the primary analysis: MolTrans’s protein-encoder self-attention</w:t>
-      </w:r>
-      <w:r>
-        <w:t xml:space="preserve"> </w:t>
-      </w:r>
-      <w:r>
-        <w:t xml:space="preserve">(last layer, mean over heads), HyperAttentionDTI’s channel-mean attention placed at the centre of each convolution window, DrugBAN’s bilinear</w:t>
-      </w:r>
-      <w:r>
-        <w:t xml:space="preserve"> </w:t>
-      </w:r>
-      <w:r>
-        <w:t xml:space="preserve">attention summed over drug atoms and averaged over heads, and XAttn-Ref’s cross-attention weights; each is projected to one non-negative weight per</w:t>
-      </w:r>
-      <w:r>
-        <w:t xml:space="preserve"> </w:t>
-      </w:r>
-      <w:r>
-        <w:t xml:space="preserve">residue. Whether each primary readout matches the map its authors display has not been confirmed against their figures; alternative readouts are</w:t>
-      </w:r>
-      <w:r>
-        <w:t xml:space="preserve"> </w:t>
-      </w:r>
-      <w:r>
-        <w:t xml:space="preserve">a sensitivity analysis (Supplement).</w:t>
-      </w:r>
-    </w:p>
-    <w:bookmarkEnd w:id="13"/>
-    <w:bookmarkStart w:id="14" w:name="ground-truths-and-plausibility"/>
-    <w:p>
-      <w:pPr>
-        <w:pStyle w:val="Heading2"/>
-      </w:pPr>
-      <w:r>
-        <w:t xml:space="preserve">2.3 Ground truths and plausibility</w:t>
-      </w:r>
-    </w:p>
-    <w:p>
-      <w:pPr>
-        <w:pStyle w:val="FirstParagraph"/>
-      </w:pPr>
-      <w:r>
-        <w:t xml:space="preserve">Two ground truths at different resolutions are used.</w:t>
-      </w:r>
-      <w:r>
-        <w:t xml:space="preserve"> </w:t>
-      </w:r>
       <w:r>
         <w:rPr>
           <w:b/>
           <w:bCs/>
         </w:rPr>
-        <w:t xml:space="preserve">UniProt residues</w:t>
-      </w:r>
-      <w:r>
-        <w:t xml:space="preserve">: sequence features of type Binding site, Active site and Nucleotide</w:t>
-      </w:r>
-      <w:r>
-        <w:t xml:space="preserve"> </w:t>
-      </w:r>
-      <w:r>
-        <w:t xml:space="preserve">binding (The UniProt Consortium, 2025), re-numbered onto each dataset sequence by alignment so that a site points at the residue the model read.</w:t>
-      </w:r>
-      <w:r>
-        <w:t xml:space="preserve"> </w:t>
-      </w:r>
+        <w:t xml:space="preserve">Chance, ceiling and a uniform floor.</w:t>
+      </w:r>
+      <w:r>
+        <w:t xml:space="preserve"> </w:t>
+      </w:r>
+      <w:r>
+        <w:t xml:space="preserve">Every precision@k is reported beside its chance and ceiling, and a uniform map (equal weight on every</w:t>
+      </w:r>
+      <w:r>
+        <w:t xml:space="preserve"> </w:t>
+      </w:r>
+      <w:r>
+        <w:t xml:space="preserve">residue) is passed through the same grid as an additional subject.</w:t>
+      </w:r>
+    </w:p>
+    <w:p>
+      <w:pPr>
+        <w:pStyle w:val="BodyText"/>
+      </w:pPr>
       <w:r>
         <w:rPr>
           <w:b/>
           <w:bCs/>
         </w:rPr>
-        <w:t xml:space="preserve">KLIFS pocket</w:t>
-      </w:r>
-      <w:r>
-        <w:t xml:space="preserve">: the 85 residues lining the ATP cleft of every kinase (van Linden et al., 2014; Kanev et al., 2021), placed on each sequence by the</w:t>
-      </w:r>
-      <w:r>
-        <w:t xml:space="preserve"> </w:t>
-      </w:r>
-      <w:r>
-        <w:t xml:space="preserve">same alignment. Proteins are scored within their first 1,000 residues.</w:t>
-      </w:r>
-    </w:p>
-    <w:p>
-      <w:pPr>
-        <w:pStyle w:val="BodyText"/>
-      </w:pPr>
-      <w:r>
-        <w:t xml:space="preserve">Plausibility is precision@k, the fraction of a protein’s k most-attended residues that are sites, with k = 10 fixed before any result existed. It is</w:t>
-      </w:r>
-      <w:r>
-        <w:t xml:space="preserve"> </w:t>
-      </w:r>
-      <w:r>
-        <w:t xml:space="preserve">computed on one test pair per protein, so that proteins measured against many drugs are not weighted by that count. Each protein’s chance level is</w:t>
-      </w:r>
-      <w:r>
-        <w:t xml:space="preserve"> </w:t>
-      </w:r>
-      <w:r>
-        <w:t xml:space="preserve">(sites in the window) ÷ (window length), the exact expectation for k uniformly random residues, and its ceiling is min(sites, k) ÷ k.</w:t>
-      </w:r>
-    </w:p>
-    <w:bookmarkEnd w:id="14"/>
-    <w:bookmarkStart w:id="15" w:name="the-calibrated-battery"/>
-    <w:p>
-      <w:pPr>
-        <w:pStyle w:val="Heading2"/>
-      </w:pPr>
-      <w:r>
-        <w:t xml:space="preserve">2.4 The calibrated battery</w:t>
-      </w:r>
-    </w:p>
-    <w:p>
-      <w:pPr>
-        <w:pStyle w:val="FirstParagraph"/>
-      </w:pPr>
-      <w:r>
-        <w:t xml:space="preserve">A verdict is read only against the following instruments, each implemented once and applied identically to every model it covers.</w:t>
-      </w:r>
-    </w:p>
-    <w:p>
-      <w:pPr>
-        <w:pStyle w:val="BodyText"/>
-      </w:pPr>
+        <w:t xml:space="preserve">Permutation test and family-wise correction.</w:t>
+      </w:r>
+      <w:r>
+        <w:t xml:space="preserve"> </w:t>
+      </w:r>
+      <w:r>
+        <w:t xml:space="preserve">For each cell the null draws k random residues per protein and averages over the split, preserving</w:t>
+      </w:r>
+      <w:r>
+        <w:t xml:space="preserve"> </w:t>
+      </w:r>
+      <w:r>
+        <w:t xml:space="preserve">the split’s mix of lengths and site counts; the p-value uses the add-one estimator over 10,000 permutations, and the</w:t>
+      </w:r>
+      <w:r>
+        <w:t xml:space="preserve"> </w:t>
+      </w:r>
       <w:r>
         <w:rPr>
           <w:b/>
           <w:bCs/>
         </w:rPr>
-        <w:t xml:space="preserve">Chance, ceiling and a uniform floor.</w:t>
-      </w:r>
-      <w:r>
-        <w:t xml:space="preserve"> </w:t>
-      </w:r>
-      <w:r>
-        <w:t xml:space="preserve">Every precision@k is reported beside its chance and ceiling, and a uniform map (equal weight on every</w:t>
-      </w:r>
-      <w:r>
-        <w:t xml:space="preserve"> </w:t>
-      </w:r>
-      <w:r>
-        <w:t xml:space="preserve">residue) is passed through the same grid as an additional subject.</w:t>
+        <w:t xml:space="preserve">median over the three seeds</w:t>
+      </w:r>
+      <w:r>
+        <w:t xml:space="preserve"> </w:t>
+      </w:r>
+      <w:r>
+        <w:t xml:space="preserve">is</w:t>
+      </w:r>
+      <w:r>
+        <w:t xml:space="preserve"> </w:t>
+      </w:r>
+      <w:r>
+        <w:t xml:space="preserve">the cell’s p-value. Holm correction (Holm, 1979) is applied once over each dataset’s family: 20 DAVIS cells (four models and the uniform map at four</w:t>
+      </w:r>
+      <w:r>
+        <w:t xml:space="preserve"> </w:t>
+      </w:r>
+      <w:r>
+        <w:t xml:space="preserve">levels) and 8 KIBA cells (three models and the uniform map at two levels).</w:t>
+      </w:r>
+      <w:r>
+        <w:t xml:space="preserve"> </w:t>
+      </w:r>
+      <w:r>
+        <w:t xml:space="preserve">The survival counts reported here (1 of 20 DAVIS cells, 0 of 8 KIBA cells) therefore describe this median-over-seeds rule, not individual seeds: a</w:t>
+      </w:r>
+      <w:r>
+        <w:t xml:space="preserve"> </w:t>
+      </w:r>
+      <w:r>
+        <w:t xml:space="preserve">Holm correction over the 48 per-seed exact tests instead retains 5 seed-runs, and over the 18 KIBA per-seed tests 3, because single seeds can clear a</w:t>
+      </w:r>
+      <w:r>
+        <w:t xml:space="preserve"> </w:t>
+      </w:r>
+      <w:r>
+        <w:t xml:space="preserve">corrected threshold that their median does not. Recomputing the Holm correction from the exact per-seed p-values instead of the 10,000-permutation estimates leaves the same survivors (1 of 20 and 0 of 8).</w:t>
+      </w:r>
+      <w:r>
+        <w:t xml:space="preserve"> </w:t>
+      </w:r>
+      <w:r>
+        <w:t xml:space="preserve">The families are declared, not pre-registered: they grew from 16 to 20 (DAVIS) and from 6 to 8 (KIBA) when DrugBAN and XAttn-Ref’s KIBA cells were</w:t>
+      </w:r>
+      <w:r>
+        <w:t xml:space="preserve"> </w:t>
+      </w:r>
+      <w:r>
+        <w:t xml:space="preserve">added after the first results, and were frozen by a dated protocol amendment before any further analysis.</w:t>
       </w:r>
     </w:p>
     <w:p>
@@ -1018,81 +978,49 @@
           <w:b/>
           <w:bCs/>
         </w:rPr>
-        <w:t xml:space="preserve">Permutation test and family-wise correction.</w:t>
-      </w:r>
-      <w:r>
-        <w:t xml:space="preserve"> </w:t>
-      </w:r>
-      <w:r>
-        <w:t xml:space="preserve">For each cell the null draws k random residues per protein and averages over the split, preserving</w:t>
-      </w:r>
-      <w:r>
-        <w:t xml:space="preserve"> </w:t>
-      </w:r>
-      <w:r>
-        <w:t xml:space="preserve">the split’s mix of lengths and site counts; the p-value uses the add-one estimator over 10,000 permutations, and the</w:t>
-      </w:r>
-      <w:r>
-        <w:t xml:space="preserve"> </w:t>
-      </w:r>
+        <w:t xml:space="preserve">Positive control.</w:t>
+      </w:r>
+      <w:r>
+        <w:t xml:space="preserve"> </w:t>
+      </w:r>
+      <w:r>
+        <w:t xml:space="preserve">Explanations of known quality are scored by the same functions on the real test proteins: at dose d, each true site is ranked</w:t>
+      </w:r>
+      <w:r>
+        <w:t xml:space="preserve"> </w:t>
+      </w:r>
+      <w:r>
+        <w:t xml:space="preserve">above every non-site with probability d. The oracle (d = 1) reaches its ceiling, and a dose of 0.02 is detected at every DAVIS level, so a null result</w:t>
+      </w:r>
+      <w:r>
+        <w:t xml:space="preserve"> </w:t>
+      </w:r>
+      <w:r>
+        <w:t xml:space="preserve">reflects the explanation and not the test’s resolution.</w:t>
+      </w:r>
+    </w:p>
+    <w:p>
+      <w:pPr>
+        <w:pStyle w:val="BodyText"/>
+      </w:pPr>
       <w:r>
         <w:rPr>
           <w:b/>
           <w:bCs/>
         </w:rPr>
-        <w:t xml:space="preserve">median over the three seeds</w:t>
-      </w:r>
-      <w:r>
-        <w:t xml:space="preserve"> </w:t>
-      </w:r>
-      <w:r>
-        <w:t xml:space="preserve">is</w:t>
-      </w:r>
-      <w:r>
-        <w:t xml:space="preserve"> </w:t>
-      </w:r>
-      <w:r>
-        <w:t xml:space="preserve">the cell’s p-value. Holm correction (Holm, 1979) is applied once over each dataset’s family: 20 DAVIS cells (four models and the uniform map at four</w:t>
-      </w:r>
-      <w:r>
-        <w:t xml:space="preserve"> </w:t>
-      </w:r>
-      <w:r>
-        <w:t xml:space="preserve">levels) and 8 KIBA cells (three models and the uniform map at two levels).</w:t>
-      </w:r>
-    </w:p>
-    <w:p>
-      <w:pPr>
-        <w:pStyle w:val="BodyText"/>
-      </w:pPr>
-      <w:r>
-        <w:t xml:space="preserve">The survival counts reported here (1 of 20 DAVIS cells, 0 of 8 KIBA cells) therefore describe this median-over-seeds rule, not individual seeds: a</w:t>
-      </w:r>
-      <w:r>
-        <w:t xml:space="preserve"> </w:t>
-      </w:r>
-      <w:r>
-        <w:t xml:space="preserve">Holm correction over the 48 per-seed exact tests instead retains 5 seed-runs, and over the 18 KIBA per-seed tests 3, because single seeds can clear a</w:t>
-      </w:r>
-      <w:r>
-        <w:t xml:space="preserve"> </w:t>
-      </w:r>
-      <w:r>
-        <w:t xml:space="preserve">corrected threshold that their median does not. Recomputing the Holm correction from the exact per-seed p-values instead of the 10,000-permutation estimates leaves the same survivors (1 of 20 and 0 of 8).</w:t>
-      </w:r>
-    </w:p>
-    <w:p>
-      <w:pPr>
-        <w:pStyle w:val="BodyText"/>
-      </w:pPr>
-      <w:r>
-        <w:t xml:space="preserve">The families are declared, not pre-registered: they grew from 16 to 20 (DAVIS) and from 6 to 8 (KIBA) when DrugBAN and XAttn-Ref’s KIBA cells were</w:t>
-      </w:r>
-      <w:r>
-        <w:t xml:space="preserve"> </w:t>
-      </w:r>
-      <w:r>
-        <w:t xml:space="preserve">added after the first results, and were frozen by a dated protocol amendment before any further analysis.</w:t>
+        <w:t xml:space="preserve">Positional and residue-identity nulls.</w:t>
+      </w:r>
+      <w:r>
+        <w:t xml:space="preserve"> </w:t>
+      </w:r>
+      <w:r>
+        <w:t xml:space="preserve">Borrowed-map, same-residue and within-span nulls test whether an above-chance score could arise from where in</w:t>
+      </w:r>
+      <w:r>
+        <w:t xml:space="preserve"> </w:t>
+      </w:r>
+      <w:r>
+        <w:t xml:space="preserve">the sequence a map concentrates, or which amino acids it prefers, rather than from the sites.</w:t>
       </w:r>
     </w:p>
     <w:p>
@@ -1104,60 +1032,6 @@
           <w:b/>
           <w:bCs/>
         </w:rPr>
-        <w:t xml:space="preserve">Positive control.</w:t>
-      </w:r>
-      <w:r>
-        <w:t xml:space="preserve"> </w:t>
-      </w:r>
-      <w:r>
-        <w:t xml:space="preserve">Explanations of known quality are scored by the same functions on the real test proteins: at dose d, each true site is ranked</w:t>
-      </w:r>
-      <w:r>
-        <w:t xml:space="preserve"> </w:t>
-      </w:r>
-      <w:r>
-        <w:t xml:space="preserve">above every non-site with probability d. The oracle (d = 1) reaches its ceiling, and a dose of 0.02 is detected at every DAVIS level, so a null result</w:t>
-      </w:r>
-      <w:r>
-        <w:t xml:space="preserve"> </w:t>
-      </w:r>
-      <w:r>
-        <w:t xml:space="preserve">reflects the explanation and not the test’s resolution.</w:t>
-      </w:r>
-    </w:p>
-    <w:p>
-      <w:pPr>
-        <w:pStyle w:val="BodyText"/>
-      </w:pPr>
-      <w:r>
-        <w:rPr>
-          <w:b/>
-          <w:bCs/>
-        </w:rPr>
-        <w:t xml:space="preserve">Positional and residue-identity nulls.</w:t>
-      </w:r>
-      <w:r>
-        <w:t xml:space="preserve"> </w:t>
-      </w:r>
-      <w:r>
-        <w:t xml:space="preserve">Borrowed-map, same-residue and within-span nulls test whether an above-chance score could arise from where in</w:t>
-      </w:r>
-      <w:r>
-        <w:t xml:space="preserve"> </w:t>
-      </w:r>
-      <w:r>
-        <w:t xml:space="preserve">the sequence a map concentrates, or which amino acids it prefers, rather than from the sites.</w:t>
-      </w:r>
-    </w:p>
-    <w:p>
-      <w:pPr>
-        <w:pStyle w:val="BodyText"/>
-      </w:pPr>
-      <w:r>
-        <w:rPr>
-          <w:b/>
-          <w:bCs/>
-        </w:rPr>
         <w:t xml:space="preserve">Faithfulness.</w:t>
       </w:r>
       <w:r>
@@ -1210,8 +1084,8 @@
         <w:t xml:space="preserve">the same intervention.</w:t>
       </w:r>
     </w:p>
-    <w:bookmarkEnd w:id="15"/>
-    <w:bookmarkStart w:id="16" w:name="seed-instability-and-effect-sizes"/>
+    <w:bookmarkEnd w:id="14"/>
+    <w:bookmarkStart w:id="15" w:name="seed-instability-and-effect-sizes"/>
     <w:p>
       <w:pPr>
         <w:pStyle w:val="Heading2"/>
@@ -1309,11 +1183,9 @@
       <w:r>
         <w:t xml:space="preserve">the contrast is the point.</w:t>
       </w:r>
-    </w:p>
-    <w:p>
-      <w:pPr>
-        <w:pStyle w:val="BodyText"/>
-      </w:pPr>
+      <w:r>
+        <w:t xml:space="preserve"> </w:t>
+      </w:r>
       <w:r>
         <w:t xml:space="preserve">Accuracy is reported as AUROC and AUPRC, mean ± sample SD over three seeds. The association between accuracy and localisation is described by</w:t>
       </w:r>
@@ -1324,14 +1196,44 @@
         <w:t xml:space="preserve">Spearman’s ρ across cells with a bootstrap interval; it is a description, not a test.</w:t>
       </w:r>
     </w:p>
+    <w:bookmarkEnd w:id="15"/>
+    <w:bookmarkStart w:id="16" w:name="quantifying-the-davis-leak"/>
+    <w:p>
+      <w:pPr>
+        <w:pStyle w:val="Heading2"/>
+      </w:pPr>
+      <w:r>
+        <w:t xml:space="preserve">2.6 Quantifying the DAVIS leak</w:t>
+      </w:r>
+    </w:p>
+    <w:p>
+      <w:pPr>
+        <w:pStyle w:val="FirstParagraph"/>
+      </w:pPr>
+      <w:r>
+        <w:t xml:space="preserve">The accuracy anchor (DeepDTA) was retrained at the cold-target level on two further training sets of equal size (17,748 rows): one with every</w:t>
+      </w:r>
+      <w:r>
+        <w:t xml:space="preserve"> </w:t>
+      </w:r>
+      <w:r>
+        <w:t xml:space="preserve">seen-by-sequence target removed, and one that keeps the leaked targets while matching that row count and positive count. The difference between the</w:t>
+      </w:r>
+      <w:r>
+        <w:t xml:space="preserve"> </w:t>
+      </w:r>
+      <w:r>
+        <w:t xml:space="preserve">two, per seed and on the same test set, is the leak; the difference between the original and the matched set is the cost of the smaller training set.</w:t>
+      </w:r>
+    </w:p>
     <w:bookmarkEnd w:id="16"/>
-    <w:bookmarkStart w:id="17" w:name="quantifying-the-davis-leak"/>
+    <w:bookmarkStart w:id="17" w:name="reproducibility"/>
     <w:p>
       <w:pPr>
         <w:pStyle w:val="Heading2"/>
       </w:pPr>
       <w:r>
-        <w:t xml:space="preserve">2.6 Quantifying the DAVIS leak</w:t>
+        <w:t xml:space="preserve">2.7 Reproducibility</w:t>
       </w:r>
     </w:p>
     <w:p>
@@ -1339,29 +1241,33 @@
         <w:pStyle w:val="FirstParagraph"/>
       </w:pPr>
       <w:r>
-        <w:t xml:space="preserve">The accuracy anchor (DeepDTA) was retrained at the cold-target level on two further training sets of equal size (17,748 rows): one with every</w:t>
-      </w:r>
-      <w:r>
-        <w:t xml:space="preserve"> </w:t>
-      </w:r>
-      <w:r>
-        <w:t xml:space="preserve">seen-by-sequence target removed, and one that keeps the leaked targets while matching that row count and positive count. The difference between the</w:t>
-      </w:r>
-      <w:r>
-        <w:t xml:space="preserve"> </w:t>
-      </w:r>
-      <w:r>
-        <w:t xml:space="preserve">two, per seed and on the same test set, is the leak; the difference between the original and the matched set is the cost of the smaller training set.</w:t>
+        <w:t xml:space="preserve">Analysis runs from one entry point per dataset. Split and ground-truth files are fixed by SHA-256 in a manifest, the vendored models are unmodified,</w:t>
+      </w:r>
+      <w:r>
+        <w:t xml:space="preserve"> </w:t>
+      </w:r>
+      <w:r>
+        <w:t xml:space="preserve">and every number in this manuscript carries a machine-checked source tag. Code and outputs: see Availability.</w:t>
       </w:r>
     </w:p>
     <w:bookmarkEnd w:id="17"/>
-    <w:bookmarkStart w:id="18" w:name="reproducibility"/>
+    <w:bookmarkEnd w:id="18"/>
+    <w:bookmarkStart w:id="37" w:name="results"/>
+    <w:p>
+      <w:pPr>
+        <w:pStyle w:val="Heading1"/>
+      </w:pPr>
+      <w:r>
+        <w:t xml:space="preserve">3 Results</w:t>
+      </w:r>
+    </w:p>
+    <w:bookmarkStart w:id="19" w:name="accuracy-of-the-retrained-models"/>
     <w:p>
       <w:pPr>
         <w:pStyle w:val="Heading2"/>
       </w:pPr>
       <w:r>
-        <w:t xml:space="preserve">2.7 Reproducibility</w:t>
+        <w:t xml:space="preserve">3.1 Accuracy of the retrained models</w:t>
       </w:r>
     </w:p>
     <w:p>
@@ -1369,33 +1275,35 @@
         <w:pStyle w:val="FirstParagraph"/>
       </w:pPr>
       <w:r>
-        <w:t xml:space="preserve">Analysis runs from one entry point per dataset. Split and ground-truth files are fixed by SHA-256 in a manifest, the vendored models are unmodified,</w:t>
-      </w:r>
-      <w:r>
-        <w:t xml:space="preserve"> </w:t>
-      </w:r>
-      <w:r>
-        <w:t xml:space="preserve">and every number in this manuscript carries a machine-checked source tag. Code and outputs: see Availability.</w:t>
-      </w:r>
-    </w:p>
-    <w:bookmarkEnd w:id="18"/>
+        <w:t xml:space="preserve">Every model was retrained with its authors’ recipe and scored on the same test sets (full table in the Supplement). At DAVIS’s random level all five</w:t>
+      </w:r>
+      <w:r>
+        <w:t xml:space="preserve"> </w:t>
+      </w:r>
+      <w:r>
+        <w:t xml:space="preserve">reach a test AUROC between 0.891 (DrugBAN) and 0.937 (HyperAttentionDTI), so the explanation results below do not come from models that failed to</w:t>
+      </w:r>
+      <w:r>
+        <w:t xml:space="preserve"> </w:t>
+      </w:r>
+      <w:r>
+        <w:t xml:space="preserve">train. Accuracy falls with distribution shift, most at the cold-pair level, where it ranges from 0.568 (MolTrans) to 0.728 (DeepDTA, which has no</w:t>
+      </w:r>
+      <w:r>
+        <w:t xml:space="preserve"> </w:t>
+      </w:r>
+      <w:r>
+        <w:t xml:space="preserve">attention), and the seed-to-seed standard deviation grows with it: 0.001–0.006 at the random level against 0.025–0.099 at cold-pair.</w:t>
+      </w:r>
+    </w:p>
     <w:bookmarkEnd w:id="19"/>
-    <w:bookmarkStart w:id="38" w:name="results"/>
-    <w:p>
-      <w:pPr>
-        <w:pStyle w:val="Heading1"/>
-      </w:pPr>
-      <w:r>
-        <w:t xml:space="preserve">3 Results</w:t>
-      </w:r>
-    </w:p>
-    <w:bookmarkStart w:id="20" w:name="accuracy-of-the-retrained-models"/>
+    <w:bookmarkStart w:id="23" w:name="X37396230811e488263ffbc0b6db8eb522da5085"/>
     <w:p>
       <w:pPr>
         <w:pStyle w:val="Heading2"/>
       </w:pPr>
       <w:r>
-        <w:t xml:space="preserve">3.1 Accuracy of the retrained models</w:t>
+        <w:t xml:space="preserve">3.2 Binding-site verdicts are not self-consistent across training seeds</w:t>
       </w:r>
     </w:p>
     <w:p>
@@ -1403,42 +1311,6 @@
         <w:pStyle w:val="FirstParagraph"/>
       </w:pPr>
       <w:r>
-        <w:t xml:space="preserve">Every model was retrained with its authors’ recipe and scored on the same test sets (full table in the Supplement). At DAVIS’s random level all five</w:t>
-      </w:r>
-      <w:r>
-        <w:t xml:space="preserve"> </w:t>
-      </w:r>
-      <w:r>
-        <w:t xml:space="preserve">reach a test AUROC between 0.891 (DrugBAN) and 0.937 (HyperAttentionDTI), so the explanation results below do not come from models that failed to</w:t>
-      </w:r>
-      <w:r>
-        <w:t xml:space="preserve"> </w:t>
-      </w:r>
-      <w:r>
-        <w:t xml:space="preserve">train. Accuracy falls with distribution shift, most at the cold-pair level, where it ranges from 0.568 (MolTrans) to 0.728 (DeepDTA, which has no</w:t>
-      </w:r>
-      <w:r>
-        <w:t xml:space="preserve"> </w:t>
-      </w:r>
-      <w:r>
-        <w:t xml:space="preserve">attention), and the seed-to-seed standard deviation grows with it: 0.001–0.006 at the random level against 0.025–0.099 at cold-pair.</w:t>
-      </w:r>
-    </w:p>
-    <w:bookmarkEnd w:id="20"/>
-    <w:bookmarkStart w:id="24" w:name="X37396230811e488263ffbc0b6db8eb522da5085"/>
-    <w:p>
-      <w:pPr>
-        <w:pStyle w:val="Heading2"/>
-      </w:pPr>
-      <w:r>
-        <w:t xml:space="preserve">3.2 Binding-site verdicts are not self-consistent across training seeds</w:t>
-      </w:r>
-    </w:p>
-    <w:p>
-      <w:pPr>
-        <w:pStyle w:val="FirstParagraph"/>
-      </w:pPr>
-      <w:r>
         <w:t xml:space="preserve">Scored against UniProt’s annotated residues, the three seeds of a cell disagree about their own verdict (they fall on different sides of the</w:t>
       </w:r>
       <w:r>
@@ -1453,11 +1325,9 @@
       <w:r>
         <w:t xml:space="preserve">on DAVIS, 3 of 6 on KIBA). Only 1 cell has all three seeds above the threshold; 10 have none (Figure 1).</w:t>
       </w:r>
-    </w:p>
-    <w:p>
-      <w:pPr>
-        <w:pStyle w:val="BodyText"/>
-      </w:pPr>
+      <w:r>
+        <w:t xml:space="preserve"> </w:t>
+      </w:r>
       <w:r>
         <w:t xml:space="preserve">The per-seed p-values are exact, so no sampling error enters. A count on a threshold is threshold-dependent (8 at α = 0.01, 13 at α = 0.10), and we</w:t>
       </w:r>
@@ -1467,11 +1337,9 @@
       <w:r>
         <w:t xml:space="preserve">report 11 as the exact-test value at the conventional α, not as a constant of the recipes.</w:t>
       </w:r>
-    </w:p>
-    <w:p>
-      <w:pPr>
-        <w:pStyle w:val="BodyText"/>
-      </w:pPr>
+      <w:r>
+        <w:t xml:space="preserve"> </w:t>
+      </w:r>
       <w:r>
         <w:t xml:space="preserve">The disagreement is not marginal: HyperAttentionDTI at DAVIS cold-drug places 0.025, 0.077 and 0.019 of its top-ten residues on annotated sites</w:t>
       </w:r>
@@ -1481,11 +1349,9 @@
       <w:r>
         <w:t xml:space="preserve">against a chance of 0.020. In 21 of 22 UniProt cells the range of the three seeds’ precision@10 exceeds the cell’s distance from chance.</w:t>
       </w:r>
-    </w:p>
-    <w:p>
-      <w:pPr>
-        <w:pStyle w:val="BodyText"/>
-      </w:pPr>
+      <w:r>
+        <w:t xml:space="preserve"> </w:t>
+      </w:r>
       <w:r>
         <w:t xml:space="preserve">Taken alone this descriptive criterion is weak, because a cell whose mean sits near chance meets it almost by construction, so we test seed variance</w:t>
       </w:r>
@@ -1501,11 +1367,9 @@
       <w:r>
         <w:t xml:space="preserve">10 of the 22 cells before correction, and in 8 and 7 of 22 after Holm correction over the 22 cells.</w:t>
       </w:r>
-    </w:p>
-    <w:p>
-      <w:pPr>
-        <w:pStyle w:val="BodyText"/>
-      </w:pPr>
+      <w:r>
+        <w:t xml:space="preserve"> </w:t>
+      </w:r>
       <w:r>
         <w:t xml:space="preserve">The variation is not scoring noise: collecting the explanations again from the same checkpoints moves precision@10 by a standard deviation of 0.0008</w:t>
       </w:r>
@@ -1515,11 +1379,9 @@
       <w:r>
         <w:t xml:space="preserve">per seed, against a between-seed standard deviation of 0.0121.</w:t>
       </w:r>
-    </w:p>
-    <w:p>
-      <w:pPr>
-        <w:pStyle w:val="BodyText"/>
-      </w:pPr>
+      <w:r>
+        <w:t xml:space="preserve"> </w:t>
+      </w:r>
       <w:r>
         <w:t xml:space="preserve">A bootstrap over proteins, the usual way to attach an interval to such a score, does not see this variance: for HyperAttentionDTI at DAVIS cold-drug it</w:t>
       </w:r>
@@ -1545,18 +1407,18 @@
           <wp:inline>
             <wp:extent cx="5334000" cy="3038448"/>
             <wp:effectExtent b="0" l="0" r="0" t="0"/>
-            <wp:docPr descr="Figure 1" title="" id="22" name="Picture"/>
+            <wp:docPr descr="Figure 1" title="" id="21" name="Picture"/>
             <a:graphic>
               <a:graphicData uri="http://schemas.openxmlformats.org/drawingml/2006/picture">
                 <pic:pic>
                   <pic:nvPicPr>
-                    <pic:cNvPr descr="../v2/figures/fig1_seed_instability.png" id="23" name="Picture"/>
+                    <pic:cNvPr descr="../v2/figures/fig1_seed_instability.png" id="22" name="Picture"/>
                     <pic:cNvPicPr>
                       <a:picLocks noChangeArrowheads="1" noChangeAspect="1"/>
                     </pic:cNvPicPr>
                   </pic:nvPicPr>
                   <pic:blipFill>
-                    <a:blip r:embed="rId21"/>
+                    <a:blip r:embed="rId20"/>
                     <a:stretch>
                       <a:fillRect/>
                     </a:stretch>
@@ -1609,14 +1471,80 @@
         <w:t xml:space="preserve">Precision@10 of each training seed (points) on DAVIS at four levels of shift, against UniProt residues (top) and the KLIFS 85-residue pocket (bottom). Black bar: mean of the three seeds; dashed tick: that level’s exact chance level. Seeds of one recipe that fall on both sides of chance are the instability reported here. The y-axes differ between panels.</w:t>
       </w:r>
     </w:p>
+    <w:bookmarkEnd w:id="23"/>
+    <w:bookmarkStart w:id="24" w:name="X4973426553b2ce0c1500220fabf36dcaa133b8e"/>
+    <w:p>
+      <w:pPr>
+        <w:pStyle w:val="Heading2"/>
+      </w:pPr>
+      <w:r>
+        <w:t xml:space="preserve">3.3 Under the calibrated battery, residue-level recovery rarely survives</w:t>
+      </w:r>
+    </w:p>
+    <w:p>
+      <w:pPr>
+        <w:pStyle w:val="FirstParagraph"/>
+      </w:pPr>
+      <w:r>
+        <w:t xml:space="preserve">The positive control sets the test’s resolution: an explanation that ranks as little as 0.02 of the true sites first is detected at every DAVIS level, so</w:t>
+      </w:r>
+      <w:r>
+        <w:t xml:space="preserve"> </w:t>
+      </w:r>
+      <w:r>
+        <w:t xml:space="preserve">a null below is a property of the maps and not of the test. With Holm correction over each dataset’s declared family, 1 of 20 DAVIS cells supports</w:t>
+      </w:r>
+      <w:r>
+        <w:t xml:space="preserve"> </w:t>
+      </w:r>
+      <w:r>
+        <w:t xml:space="preserve">residue-level recovery and 0 of 8 KIBA cells do. These counts describe the median-over-seeds rule of Section 2.4, not individual seeds.</w:t>
+      </w:r>
+      <w:r>
+        <w:t xml:space="preserve"> </w:t>
+      </w:r>
+      <w:r>
+        <w:t xml:space="preserve">The surviving cell is HyperAttentionDTI at the random level (precision@10 0.034 against a chance of 0.020; enrichment 1.66 [1.33, 2.00]), at p = 0.0001,</w:t>
+      </w:r>
+      <w:r>
+        <w:t xml:space="preserve"> </w:t>
+      </w:r>
+      <w:r>
+        <w:t xml:space="preserve">the smallest value 10,000 permutations can give. The uniform map, passed through the same grid, never approaches significance (p of 0.4462 or more on</w:t>
+      </w:r>
+      <w:r>
+        <w:t xml:space="preserve"> </w:t>
+      </w:r>
+      <w:r>
+        <w:t xml:space="preserve">DAVIS, 0.2251 or more on KIBA), so the test does not reward a map for being flat.</w:t>
+      </w:r>
+      <w:r>
+        <w:t xml:space="preserve"> </w:t>
+      </w:r>
+      <w:r>
+        <w:t xml:space="preserve">Once seeds are resampled the intervals agree with the correction: of the 22 UniProt cells, only this one has an interval above parity (Figure 2).</w:t>
+      </w:r>
+      <w:r>
+        <w:t xml:space="preserve"> </w:t>
+      </w:r>
+      <w:r>
+        <w:t xml:space="preserve">With proteins alone resampled, several more would, for example MolTrans at KIBA cold-drug, 1.57 [1.32, 1.82]; resampling seeds widens that interval to</w:t>
+      </w:r>
+      <w:r>
+        <w:t xml:space="preserve"> </w:t>
+      </w:r>
+      <w:r>
+        <w:t xml:space="preserve">[0.70, 2.70], and its split-level test does not survive (p = 0.07279 against a threshold of 0.00625).</w:t>
+      </w:r>
+    </w:p>
     <w:bookmarkEnd w:id="24"/>
-    <w:bookmarkStart w:id="25" w:name="X4973426553b2ce0c1500220fabf36dcaa133b8e"/>
+    <w:bookmarkStart w:id="31" w:name="X69c0f5d6bc53b4dd991174c145fa2b1c60f39e5"/>
     <w:p>
       <w:pPr>
         <w:pStyle w:val="Heading2"/>
       </w:pPr>
       <w:r>
-        <w:t xml:space="preserve">3.3 Under the calibrated battery, residue-level recovery rarely survives</w:t>
+        <w:t xml:space="preserve">3.4 What replicates is coarse: pocket enrichment and load-bearing attention</w:t>
       </w:r>
     </w:p>
     <w:p>
@@ -1624,19 +1552,43 @@
         <w:pStyle w:val="FirstParagraph"/>
       </w:pPr>
       <w:r>
-        <w:t xml:space="preserve">The positive control sets the test’s resolution: an explanation that ranks as little as 0.02 of the true sites first is detected at every DAVIS level, so</w:t>
-      </w:r>
-      <w:r>
-        <w:t xml:space="preserve"> </w:t>
-      </w:r>
-      <w:r>
-        <w:t xml:space="preserve">a null below is a property of the maps and not of the test. With Holm correction over each dataset’s declared family, 1 of 20 DAVIS cells supports</w:t>
-      </w:r>
-      <w:r>
-        <w:t xml:space="preserve"> </w:t>
-      </w:r>
-      <w:r>
-        <w:t xml:space="preserve">residue-level recovery and 0 of 8 KIBA cells do. These counts describe the median-over-seeds rule of Section 2.4, not individual seeds.</w:t>
+        <w:t xml:space="preserve">Against the 85-residue KLIFS pocket, where chance is 0.137–0.143 on DAVIS, XAttn-Ref’s map is enriched at every DAVIS level (1.54–2.10× chance) and</w:t>
+      </w:r>
+      <w:r>
+        <w:t xml:space="preserve"> </w:t>
+      </w:r>
+      <w:r>
+        <w:t xml:space="preserve">HyperAttentionDTI’s at three of the four (1.33–1.70×, cold-pair only marginally); at cold-drug HyperAttentionDTI’s interval, 1.35 [0.94, 1.73], includes</w:t>
+      </w:r>
+      <w:r>
+        <w:t xml:space="preserve"> </w:t>
+      </w:r>
+      <w:r>
+        <w:t xml:space="preserve">parity once seeds are resampled. MolTrans’s intervals include parity at every level, and DrugBAN’s map sits on chance throughout (0.98–1.04×)</w:t>
+      </w:r>
+      <w:r>
+        <w:t xml:space="preserve"> </w:t>
+      </w:r>
+      <w:r>
+        <w:t xml:space="preserve">(Figure 2). On KIBA, XAttn-Ref’s cold-drug map is at chance (1.00 [0.79, 1.27]).</w:t>
+      </w:r>
+      <w:r>
+        <w:t xml:space="preserve"> </w:t>
+      </w:r>
+      <w:r>
+        <w:t xml:space="preserve">Kinase ATP pockets are conserved and no conservation control was run, so this is a statement about a conserved region, not evidence that a ligand’s</w:t>
+      </w:r>
+      <w:r>
+        <w:t xml:space="preserve"> </w:t>
+      </w:r>
+      <w:r>
+        <w:t xml:space="preserve">contacts were learned. The positional nulls do rule out the simplest artefact for HyperAttentionDTI: its pocket hits beat a shuffle of the same attention</w:t>
+      </w:r>
+      <w:r>
+        <w:t xml:space="preserve"> </w:t>
+      </w:r>
+      <w:r>
+        <w:t xml:space="preserve">within the kinase domain in eight of its twelve seed-level cells (uncorrected), so the map prefers the pocket within the domain, not only the domain.</w:t>
       </w:r>
     </w:p>
     <w:p>
@@ -1644,102 +1596,6 @@
         <w:pStyle w:val="BodyText"/>
       </w:pPr>
       <w:r>
-        <w:t xml:space="preserve">The surviving cell is HyperAttentionDTI at the random level (precision@10 0.034 against a chance of 0.020; enrichment 1.66 [1.33, 2.00]), at p = 0.0001,</w:t>
-      </w:r>
-      <w:r>
-        <w:t xml:space="preserve"> </w:t>
-      </w:r>
-      <w:r>
-        <w:t xml:space="preserve">the smallest value 10,000 permutations can give. The uniform map, passed through the same grid, never approaches significance (p of 0.4462 or more on</w:t>
-      </w:r>
-      <w:r>
-        <w:t xml:space="preserve"> </w:t>
-      </w:r>
-      <w:r>
-        <w:t xml:space="preserve">DAVIS, 0.2251 or more on KIBA), so the test does not reward a map for being flat.</w:t>
-      </w:r>
-    </w:p>
-    <w:p>
-      <w:pPr>
-        <w:pStyle w:val="BodyText"/>
-      </w:pPr>
-      <w:r>
-        <w:t xml:space="preserve">Once seeds are resampled the intervals agree with the correction: of the 22 UniProt cells, only this one has an interval above parity (Figure 2).</w:t>
-      </w:r>
-      <w:r>
-        <w:t xml:space="preserve"> </w:t>
-      </w:r>
-      <w:r>
-        <w:t xml:space="preserve">With proteins alone resampled, several more would, for example MolTrans at KIBA cold-drug, 1.57 [1.32, 1.82]; resampling seeds widens that interval to</w:t>
-      </w:r>
-      <w:r>
-        <w:t xml:space="preserve"> </w:t>
-      </w:r>
-      <w:r>
-        <w:t xml:space="preserve">[0.70, 2.70], and its split-level test does not survive (p = 0.07279 against a threshold of 0.00625).</w:t>
-      </w:r>
-    </w:p>
-    <w:bookmarkEnd w:id="25"/>
-    <w:bookmarkStart w:id="32" w:name="X69c0f5d6bc53b4dd991174c145fa2b1c60f39e5"/>
-    <w:p>
-      <w:pPr>
-        <w:pStyle w:val="Heading2"/>
-      </w:pPr>
-      <w:r>
-        <w:t xml:space="preserve">3.4 What replicates is coarse: pocket enrichment and load-bearing attention</w:t>
-      </w:r>
-    </w:p>
-    <w:p>
-      <w:pPr>
-        <w:pStyle w:val="FirstParagraph"/>
-      </w:pPr>
-      <w:r>
-        <w:t xml:space="preserve">Against the 85-residue KLIFS pocket, where chance is 0.137–0.143 on DAVIS, XAttn-Ref’s map is enriched at every DAVIS level (1.54–2.10× chance) and</w:t>
-      </w:r>
-      <w:r>
-        <w:t xml:space="preserve"> </w:t>
-      </w:r>
-      <w:r>
-        <w:t xml:space="preserve">HyperAttentionDTI’s at three of the four (1.33–1.70×, cold-pair only marginally); at cold-drug HyperAttentionDTI’s interval, 1.35 [0.94, 1.73], includes</w:t>
-      </w:r>
-      <w:r>
-        <w:t xml:space="preserve"> </w:t>
-      </w:r>
-      <w:r>
-        <w:t xml:space="preserve">parity once seeds are resampled. MolTrans’s intervals include parity at every level, and DrugBAN’s map sits on chance throughout (0.98–1.04×)</w:t>
-      </w:r>
-      <w:r>
-        <w:t xml:space="preserve"> </w:t>
-      </w:r>
-      <w:r>
-        <w:t xml:space="preserve">(Figure 2). On KIBA, XAttn-Ref’s cold-drug map is at chance (1.00 [0.79, 1.27]).</w:t>
-      </w:r>
-    </w:p>
-    <w:p>
-      <w:pPr>
-        <w:pStyle w:val="BodyText"/>
-      </w:pPr>
-      <w:r>
-        <w:t xml:space="preserve">Kinase ATP pockets are conserved and no conservation control was run, so this is a statement about a conserved region, not evidence that a ligand’s</w:t>
-      </w:r>
-      <w:r>
-        <w:t xml:space="preserve"> </w:t>
-      </w:r>
-      <w:r>
-        <w:t xml:space="preserve">contacts were learned. The positional nulls do rule out the simplest artefact for HyperAttentionDTI: its pocket hits beat a shuffle of the same attention</w:t>
-      </w:r>
-      <w:r>
-        <w:t xml:space="preserve"> </w:t>
-      </w:r>
-      <w:r>
-        <w:t xml:space="preserve">within the kinase domain in eight of its twelve seed-level cells (uncorrected), so the map prefers the pocket within the domain, not only the domain.</w:t>
-      </w:r>
-    </w:p>
-    <w:p>
-      <w:pPr>
-        <w:pStyle w:val="BodyText"/>
-      </w:pPr>
-      <w:r>
         <w:t xml:space="preserve">Faithfulness is the most stable property measured for three of the four models. In all 16 cells of HyperAttentionDTI, MolTrans and XAttn-Ref, masking</w:t>
       </w:r>
       <w:r>
@@ -1752,7 +1608,7 @@
         <w:t xml:space="preserve"> </w:t>
       </w:r>
       <w:r>
-        <w:t xml:space="preserve">resampled (Figure 5); the effect ranges from 0.054 [0.030, 0.080] (HyperAttentionDTI, DAVIS cold-pair) to 1.21 [0.68, 1.92] (XAttn-Ref, DAVIS random),</w:t>
+        <w:t xml:space="preserve">resampled (Figure 3); the effect ranges from 0.054 [0.030, 0.080] (HyperAttentionDTI, DAVIS cold-pair) to 1.21 [0.68, 1.92] (XAttn-Ref, DAVIS random),</w:t>
       </w:r>
       <w:r>
         <w:t xml:space="preserve"> </w:t>
@@ -1766,11 +1622,9 @@
       <w:r>
         <w:t xml:space="preserve">deltas differ several-fold.</w:t>
       </w:r>
-    </w:p>
-    <w:p>
-      <w:pPr>
-        <w:pStyle w:val="BodyText"/>
-      </w:pPr>
+      <w:r>
+        <w:t xml:space="preserve"> </w:t>
+      </w:r>
       <w:r>
         <w:t xml:space="preserve">DrugBAN’s attention is not consistently load-bearing: its deltas sit near zero and change sign between seeds (at cold-drug −0.0073, −0.0036 and 0.0128 for seeds one</w:t>
       </w:r>
@@ -1786,11 +1640,9 @@
       <w:r>
         <w:t xml:space="preserve">run did not record per-pair values and no interval can be attached.</w:t>
       </w:r>
-    </w:p>
-    <w:p>
-      <w:pPr>
-        <w:pStyle w:val="BodyText"/>
-      </w:pPr>
+      <w:r>
+        <w:t xml:space="preserve"> </w:t>
+      </w:r>
       <w:r>
         <w:t xml:space="preserve">Finally, accuracy does not predict localisation: across the 48 DAVIS attention-model cells, Spearman’s ρ between AUROC and enrichment over chance is</w:t>
       </w:r>
@@ -1810,18 +1662,18 @@
           <wp:inline>
             <wp:extent cx="5334000" cy="4752109"/>
             <wp:effectExtent b="0" l="0" r="0" t="0"/>
-            <wp:docPr descr="Figure 2" title="" id="27" name="Picture"/>
+            <wp:docPr descr="Figure 2" title="" id="26" name="Picture"/>
             <a:graphic>
               <a:graphicData uri="http://schemas.openxmlformats.org/drawingml/2006/picture">
                 <pic:pic>
                   <pic:nvPicPr>
-                    <pic:cNvPr descr="../v2/figures/fig2_enrichment_forest.png" id="28" name="Picture"/>
+                    <pic:cNvPr descr="../v2/figures/fig2_enrichment_forest.png" id="27" name="Picture"/>
                     <pic:cNvPicPr>
                       <a:picLocks noChangeArrowheads="1" noChangeAspect="1"/>
                     </pic:cNvPicPr>
                   </pic:nvPicPr>
                   <pic:blipFill>
-                    <a:blip r:embed="rId26"/>
+                    <a:blip r:embed="rId25"/>
                     <a:stretch>
                       <a:fillRect/>
                     </a:stretch>
@@ -1883,18 +1735,18 @@
           <wp:inline>
             <wp:extent cx="5334000" cy="1878580"/>
             <wp:effectExtent b="0" l="0" r="0" t="0"/>
-            <wp:docPr descr="Figure 5" title="" id="30" name="Picture"/>
+            <wp:docPr descr="Figure 3" title="" id="29" name="Picture"/>
             <a:graphic>
               <a:graphicData uri="http://schemas.openxmlformats.org/drawingml/2006/picture">
                 <pic:pic>
                   <pic:nvPicPr>
-                    <pic:cNvPr descr="../v2/figures/fig5_faithfulness.png" id="31" name="Picture"/>
+                    <pic:cNvPr descr="../v2/figures/fig5_faithfulness.png" id="30" name="Picture"/>
                     <pic:cNvPicPr>
                       <a:picLocks noChangeArrowheads="1" noChangeAspect="1"/>
                     </pic:cNvPicPr>
                   </pic:nvPicPr>
                   <pic:blipFill>
-                    <a:blip r:embed="rId29"/>
+                    <a:blip r:embed="rId28"/>
                     <a:stretch>
                       <a:fillRect/>
                     </a:stretch>
@@ -1926,7 +1778,7 @@
         <w:pStyle w:val="ImageCaption"/>
       </w:pPr>
       <w:r>
-        <w:t xml:space="preserve">Figure 5</w:t>
+        <w:t xml:space="preserve">Figure 3</w:t>
       </w:r>
     </w:p>
     <w:p>
@@ -1938,7 +1790,7 @@
           <w:b/>
           <w:bCs/>
         </w:rPr>
-        <w:t xml:space="preserve">Figure 5. Masking the attended residues matters more than masking random ones.</w:t>
+        <w:t xml:space="preserve">Figure 3. Masking the attended residues matters more than masking random ones.</w:t>
       </w:r>
       <w:r>
         <w:t xml:space="preserve"> </w:t>
@@ -1947,14 +1799,56 @@
         <w:t xml:space="preserve">Faithfulness delta (attended masking minus a size-matched random-masking control), mean over proteins, with 95% two-way bootstrap intervals (proteins and seeds resampled, 10,000 resamples). MolTrans is measured in its own token space and the others in residue space, so the three panels do not share a scale. DrugBAN is not drawn: its per-seed deltas are reported in the text but carry no interval, because its per-pair values were not recorded. No KIBA cell exists for XAttn-Ref.</w:t>
       </w:r>
     </w:p>
+    <w:bookmarkEnd w:id="31"/>
+    <w:bookmarkStart w:id="32" w:name="X0143d6ba96157ba18dd43b44e2f2b1a6fdf5bc6"/>
+    <w:p>
+      <w:pPr>
+        <w:pStyle w:val="Heading2"/>
+      </w:pPr>
+      <w:r>
+        <w:t xml:space="preserve">3.5 The verdict depends on the readout and on what the map is a function of</w:t>
+      </w:r>
+    </w:p>
+    <w:p>
+      <w:pPr>
+        <w:pStyle w:val="FirstParagraph"/>
+      </w:pPr>
+      <w:r>
+        <w:t xml:space="preserve">A multi-channel attention tensor must be reduced to one weight per residue, and the choice decides the verdict. Two defensible reductions of the same</w:t>
+      </w:r>
+      <w:r>
+        <w:t xml:space="preserve"> </w:t>
+      </w:r>
+      <w:r>
+        <w:t xml:space="preserve">HyperAttentionDTI weights place 0.367 and 0.081 of their top-ten residues in the ATP pocket at the cold-target level, against a chance of 0.140, a single model and level.</w:t>
+      </w:r>
+      <w:r>
+        <w:t xml:space="preserve"> </w:t>
+      </w:r>
+      <w:r>
+        <w:t xml:space="preserve">Whether a map can depend on the drug is a property of the computation graph. For 25 proteins each paired with four drugs, the MolTrans readout scored</w:t>
+      </w:r>
+      <w:r>
+        <w:t xml:space="preserve"> </w:t>
+      </w:r>
+      <w:r>
+        <w:t xml:space="preserve">here gives the same top ten for every drug (100% of 150 drug pairs), HyperAttentionDTI’s in 72%, and DrugBAN’s in 0%. A map that cannot change with</w:t>
+      </w:r>
+      <w:r>
+        <w:t xml:space="preserve"> </w:t>
+      </w:r>
+      <w:r>
+        <w:t xml:space="preserve">the drug cannot mark that drug’s binding site, whatever its hit rate. MolTrans’s interaction map, a different readout of the same model, does change with the drug (identical top ten in 0% of the same 150 pairs).</w:t>
+      </w:r>
+    </w:p>
     <w:bookmarkEnd w:id="32"/>
-    <w:bookmarkStart w:id="33" w:name="X0143d6ba96157ba18dd43b44e2f2b1a6fdf5bc6"/>
+    <w:bookmarkStart w:id="36" w:name="daviss-sequence-leakage-quantified"/>
     <w:p>
       <w:pPr>
         <w:pStyle w:val="Heading2"/>
       </w:pPr>
       <w:r>
-        <w:t xml:space="preserve">3.5 The verdict depends on the readout and on what the map is a function of</w:t>
+        <w:t xml:space="preserve">3.6 DAVIS’s sequence leakage, quantified</w:t>
       </w:r>
     </w:p>
     <w:p>
@@ -1962,50 +1856,6 @@
         <w:pStyle w:val="FirstParagraph"/>
       </w:pPr>
       <w:r>
-        <w:t xml:space="preserve">A multi-channel attention tensor must be reduced to one weight per residue, and the choice decides the verdict. Two defensible reductions of the same</w:t>
-      </w:r>
-      <w:r>
-        <w:t xml:space="preserve"> </w:t>
-      </w:r>
-      <w:r>
-        <w:t xml:space="preserve">HyperAttentionDTI weights place 0.367 and 0.081 of their top-ten residues in the ATP pocket at the cold-target level, against a chance of 0.140, a single model and level.</w:t>
-      </w:r>
-    </w:p>
-    <w:p>
-      <w:pPr>
-        <w:pStyle w:val="BodyText"/>
-      </w:pPr>
-      <w:r>
-        <w:t xml:space="preserve">Whether a map can depend on the drug is a property of the computation graph. For 25 proteins each paired with four drugs, the MolTrans readout scored</w:t>
-      </w:r>
-      <w:r>
-        <w:t xml:space="preserve"> </w:t>
-      </w:r>
-      <w:r>
-        <w:t xml:space="preserve">here gives the same top ten for every drug (100% of 150 drug pairs), HyperAttentionDTI’s in 72%, and DrugBAN’s in 0%. A map that cannot change with</w:t>
-      </w:r>
-      <w:r>
-        <w:t xml:space="preserve"> </w:t>
-      </w:r>
-      <w:r>
-        <w:t xml:space="preserve">the drug cannot mark that drug’s binding site, whatever its hit rate. MolTrans’s interaction map, a different readout of the same model, does change with the drug (identical top ten in 0% of the same 150 pairs).</w:t>
-      </w:r>
-    </w:p>
-    <w:bookmarkEnd w:id="33"/>
-    <w:bookmarkStart w:id="37" w:name="daviss-sequence-leakage-quantified"/>
-    <w:p>
-      <w:pPr>
-        <w:pStyle w:val="Heading2"/>
-      </w:pPr>
-      <w:r>
-        <w:t xml:space="preserve">3.6 DAVIS’s sequence leakage, quantified</w:t>
-      </w:r>
-    </w:p>
-    <w:p>
-      <w:pPr>
-        <w:pStyle w:val="FirstParagraph"/>
-      </w:pPr>
-      <w:r>
         <w:t xml:space="preserve">DAVIS gives 54 of its mutant targets exactly the wild-type sequence, so 12 of the 88 cold-target test targets are seen by sequence in training: 816 of</w:t>
       </w:r>
       <w:r>
@@ -2014,11 +1864,9 @@
       <w:r>
         <w:t xml:space="preserve">5984 test rows (13.6%).</w:t>
       </w:r>
-    </w:p>
-    <w:p>
-      <w:pPr>
-        <w:pStyle w:val="BodyText"/>
-      </w:pPr>
+      <w:r>
+        <w:t xml:space="preserve"> </w:t>
+      </w:r>
       <w:r>
         <w:t xml:space="preserve">The retrain was made on DeepDTA, the accuracy anchor, at the cold-target split, with three seeds, and separates the leak from the loss of training rows</w:t>
       </w:r>
@@ -2026,7 +1874,7 @@
         <w:t xml:space="preserve"> </w:t>
       </w:r>
       <w:r>
-        <w:t xml:space="preserve">(Figure 6). On the leaked rows the sequence match inflates AUROC by 0.116 (95% t-interval [0.098, 0.134], p = 0.0013). On the strictly unleaked rows no</w:t>
+        <w:t xml:space="preserve">(Figure 4). On the leaked rows the sequence match inflates AUROC by 0.116 (95% t-interval [0.098, 0.134], p = 0.0013). On the strictly unleaked rows no</w:t>
       </w:r>
       <w:r>
         <w:t xml:space="preserve"> </w:t>
@@ -2056,18 +1904,18 @@
           <wp:inline>
             <wp:extent cx="5334000" cy="2196647"/>
             <wp:effectExtent b="0" l="0" r="0" t="0"/>
-            <wp:docPr descr="Figure 6" title="" id="35" name="Picture"/>
+            <wp:docPr descr="Figure 4" title="" id="34" name="Picture"/>
             <a:graphic>
               <a:graphicData uri="http://schemas.openxmlformats.org/drawingml/2006/picture">
                 <pic:pic>
                   <pic:nvPicPr>
-                    <pic:cNvPr descr="../v2/figures/fig6_leakage.png" id="36" name="Picture"/>
+                    <pic:cNvPr descr="../v2/figures/fig6_leakage.png" id="35" name="Picture"/>
                     <pic:cNvPicPr>
                       <a:picLocks noChangeArrowheads="1" noChangeAspect="1"/>
                     </pic:cNvPicPr>
                   </pic:nvPicPr>
                   <pic:blipFill>
-                    <a:blip r:embed="rId34"/>
+                    <a:blip r:embed="rId33"/>
                     <a:stretch>
                       <a:fillRect/>
                     </a:stretch>
@@ -2099,7 +1947,7 @@
         <w:pStyle w:val="ImageCaption"/>
       </w:pPr>
       <w:r>
-        <w:t xml:space="preserve">Figure 6</w:t>
+        <w:t xml:space="preserve">Figure 4</w:t>
       </w:r>
     </w:p>
     <w:p>
@@ -2111,7 +1959,7 @@
           <w:b/>
           <w:bCs/>
         </w:rPr>
-        <w:t xml:space="preserve">Figure 6. What DAVIS’s sequence leakage is worth to the accuracy anchor.</w:t>
+        <w:t xml:space="preserve">Figure 4. What DAVIS’s sequence leakage is worth to the accuracy anchor.</w:t>
       </w:r>
       <w:r>
         <w:t xml:space="preserve"> </w:t>
@@ -2209,24 +2057,104 @@
         <w:t xml:space="preserve">Every result in this section concerns kinase targets; the non-kinase transfer panel is not analysed here.</w:t>
       </w:r>
     </w:p>
+    <w:bookmarkEnd w:id="36"/>
     <w:bookmarkEnd w:id="37"/>
+    <w:bookmarkStart w:id="44" w:name="discussion"/>
+    <w:p>
+      <w:pPr>
+        <w:pStyle w:val="Heading1"/>
+      </w:pPr>
+      <w:r>
+        <w:t xml:space="preserve">4 Discussion</w:t>
+      </w:r>
+    </w:p>
+    <w:bookmarkStart w:id="38" w:name="what-the-audit-shows"/>
+    <w:p>
+      <w:pPr>
+        <w:pStyle w:val="Heading2"/>
+      </w:pPr>
+      <w:r>
+        <w:t xml:space="preserve">4.1 What the audit shows</w:t>
+      </w:r>
+    </w:p>
+    <w:p>
+      <w:pPr>
+        <w:pStyle w:val="FirstParagraph"/>
+      </w:pPr>
+      <w:r>
+        <w:t xml:space="preserve">The central result is that an attention-based binding-site verdict, as a single-run report presents it, is not a stable property of a model recipe. Three retrainings of</w:t>
+      </w:r>
+      <w:r>
+        <w:t xml:space="preserve"> </w:t>
+      </w:r>
+      <w:r>
+        <w:t xml:space="preserve">the same recipe on the same split frequently disagree about whether the map finds annotated residues (11 of 22 cells), the disagreement is usually larger</w:t>
+      </w:r>
+      <w:r>
+        <w:t xml:space="preserve"> </w:t>
+      </w:r>
+      <w:r>
+        <w:t xml:space="preserve">than the effect being claimed (21 of 22), and in 7 to 8 of 22 cells the differences between seeds are significant after correction.</w:t>
+      </w:r>
+      <w:r>
+        <w:t xml:space="preserve"> </w:t>
+      </w:r>
+      <w:r>
+        <w:t xml:space="preserve">A single-run figure therefore samples one draw from a wide distribution, and an interval computed over proteins alone does not reflect it. Once chance, ceiling, a</w:t>
+      </w:r>
+      <w:r>
+        <w:t xml:space="preserve"> </w:t>
+      </w:r>
+      <w:r>
+        <w:t xml:space="preserve">uniform floor, a positive control and family-wise correction are applied, residue-level recovery survives in one DAVIS cell and in no KIBA cell.</w:t>
+      </w:r>
+    </w:p>
+    <w:p>
+      <w:pPr>
+        <w:pStyle w:val="BodyText"/>
+      </w:pPr>
+      <w:r>
+        <w:t xml:space="preserve">What does replicate is coarser. The attention of three of the four models is load-bearing in every seed; XAttn-Ref’s map concentrates in the kinase ATP pocket at</w:t>
+      </w:r>
+      <w:r>
+        <w:t xml:space="preserve"> </w:t>
+      </w:r>
+      <w:r>
+        <w:t xml:space="preserve">every DAVIS level and HyperAttentionDTI’s at three of four; DrugBAN is the exception on both counts. In the vocabulary of Jacovi and Goldberg (2020), these models</w:t>
+      </w:r>
+      <w:r>
+        <w:t xml:space="preserve"> </w:t>
+      </w:r>
+      <w:r>
+        <w:t xml:space="preserve">are faithful without being plausible at the residue level: their predictions depend on the residues they attend to, but those residues are rarely the annotated ones.</w:t>
+      </w:r>
+      <w:r>
+        <w:t xml:space="preserve"> </w:t>
+      </w:r>
+      <w:r>
+        <w:t xml:space="preserve">Pocket enrichment is also the weakest kind of plausibility, because the pocket is conserved across kinases; without a conservation control it cannot be read as</w:t>
+      </w:r>
+      <w:r>
+        <w:t xml:space="preserve"> </w:t>
+      </w:r>
+      <w:r>
+        <w:t xml:space="preserve">learned chemistry. Two further results bear on reporting: for HyperAttentionDTI the verdict depends on how a multi-channel tensor is reduced to one weight per residue, and our</w:t>
+      </w:r>
+      <w:r>
+        <w:t xml:space="preserve"> </w:t>
+      </w:r>
+      <w:r>
+        <w:t xml:space="preserve">primary readout for MolTrans cannot depend on the drug at all (its interaction map can). Accuracy, finally, is no guide to localisation.</w:t>
+      </w:r>
+    </w:p>
     <w:bookmarkEnd w:id="38"/>
-    <w:bookmarkStart w:id="45" w:name="discussion"/>
-    <w:p>
-      <w:pPr>
-        <w:pStyle w:val="Heading1"/>
-      </w:pPr>
-      <w:r>
-        <w:t xml:space="preserve">4 Discussion</w:t>
-      </w:r>
-    </w:p>
-    <w:bookmarkStart w:id="39" w:name="what-the-audit-shows"/>
+    <w:bookmarkStart w:id="39" w:name="relation-to-prior-work"/>
     <w:p>
       <w:pPr>
         <w:pStyle w:val="Heading2"/>
       </w:pPr>
       <w:r>
-        <w:t xml:space="preserve">4.1 What the audit shows</w:t>
+        <w:t xml:space="preserve">4.2 Relation to prior work</w:t>
       </w:r>
     </w:p>
     <w:p>
@@ -2234,19 +2162,55 @@
         <w:pStyle w:val="FirstParagraph"/>
       </w:pPr>
       <w:r>
-        <w:t xml:space="preserve">The central result is that an attention-based binding-site verdict, as a single-run report presents it, is not a stable property of a model recipe. Three retrainings of</w:t>
-      </w:r>
-      <w:r>
-        <w:t xml:space="preserve"> </w:t>
-      </w:r>
-      <w:r>
-        <w:t xml:space="preserve">the same recipe on the same split frequently disagree about whether the map finds annotated residues (11 of 22 cells), the disagreement is usually larger</w:t>
-      </w:r>
-      <w:r>
-        <w:t xml:space="preserve"> </w:t>
-      </w:r>
-      <w:r>
-        <w:t xml:space="preserve">than the effect being claimed (21 of 22), and in 7 to 8 of 22 cells the differences between seeds are significant after correction.</w:t>
+        <w:t xml:space="preserve">Attention has been compared with binding-site annotations in DTI before. MONN (Li et al., 2020) reported that attention-based models, without extra supervision, did</w:t>
+      </w:r>
+      <w:r>
+        <w:t xml:space="preserve"> </w:t>
+      </w:r>
+      <w:r>
+        <w:t xml:space="preserve">not give satisfactory interpretability; ICAN (Kurata and Tsukiyama, 2022) reported that some cross-attention weights match experimental binding sites with statistical</w:t>
+      </w:r>
+      <w:r>
+        <w:t xml:space="preserve"> </w:t>
+      </w:r>
+      <w:r>
+        <w:t xml:space="preserve">significance on DAVIS; and InteractBind (Meng et al., 2026, preprint) found limited localisation despite strong binding prediction across eight models. Our</w:t>
+      </w:r>
+      <w:r>
+        <w:t xml:space="preserve"> </w:t>
+      </w:r>
+      <w:r>
+        <w:t xml:space="preserve">residue-level results are consistent with the first and third. What we add is that the verdict itself is unstable across retrainings, and a battery that states when a</w:t>
+      </w:r>
+      <w:r>
+        <w:t xml:space="preserve"> </w:t>
+      </w:r>
+      <w:r>
+        <w:t xml:space="preserve">single-model significance claim of the kind ICAN reports can be trusted. Two recent audits approach DTI explanations differently: ISAAC (Tarantino et al., 2026,</w:t>
+      </w:r>
+      <w:r>
+        <w:t xml:space="preserve"> </w:t>
+      </w:r>
+      <w:r>
+        <w:t xml:space="preserve">preprint) probes models with matched mechanistic and spurious interventions and reports scores stable across training seeds, and Vefghi et al. (2026, preprint) combine</w:t>
+      </w:r>
+      <w:r>
+        <w:t xml:space="preserve"> </w:t>
+      </w:r>
+      <w:r>
+        <w:t xml:space="preserve">gradient attributions and occlusion on one model and state that this does not substitute for structural ground truth. Ours is complementary: it scores explanations</w:t>
+      </w:r>
+      <w:r>
+        <w:t xml:space="preserve"> </w:t>
+      </w:r>
+      <w:r>
+        <w:t xml:space="preserve">against structural annotations, and for these models the localisation verdicts lack the seed stability ISAAC reports for its intervention scores; whether the two</w:t>
+      </w:r>
+      <w:r>
+        <w:t xml:space="preserve"> </w:t>
+      </w:r>
+      <w:r>
+        <w:t xml:space="preserve">measures would agree on the same models is untested.</w:t>
       </w:r>
     </w:p>
     <w:p>
@@ -2254,61 +2218,47 @@
         <w:pStyle w:val="BodyText"/>
       </w:pPr>
       <w:r>
-        <w:t xml:space="preserve">A single-run figure therefore samples one draw from a wide distribution, and an interval computed over proteins alone does not reflect it. Once chance, ceiling, a</w:t>
-      </w:r>
-      <w:r>
-        <w:t xml:space="preserve"> </w:t>
-      </w:r>
-      <w:r>
-        <w:t xml:space="preserve">uniform floor, a positive control and family-wise correction are applied, residue-level recovery survives in one DAVIS cell and in no KIBA cell.</w:t>
-      </w:r>
-    </w:p>
-    <w:p>
-      <w:pPr>
-        <w:pStyle w:val="BodyText"/>
-      </w:pPr>
-      <w:r>
-        <w:t xml:space="preserve">What does replicate is coarser. The attention of three of the four models is load-bearing in every seed; XAttn-Ref’s map concentrates in the kinase ATP pocket at</w:t>
-      </w:r>
-      <w:r>
-        <w:t xml:space="preserve"> </w:t>
-      </w:r>
-      <w:r>
-        <w:t xml:space="preserve">every DAVIS level and HyperAttentionDTI’s at three of four; DrugBAN is the exception on both counts. In the vocabulary of Jacovi and Goldberg (2020), these models</w:t>
-      </w:r>
-      <w:r>
-        <w:t xml:space="preserve"> </w:t>
-      </w:r>
-      <w:r>
-        <w:t xml:space="preserve">are faithful without being plausible at the residue level: their predictions depend on the residues they attend to, but those residues are rarely the annotated ones.</w:t>
-      </w:r>
-      <w:r>
-        <w:t xml:space="preserve"> </w:t>
-      </w:r>
-      <w:r>
-        <w:t xml:space="preserve">Pocket enrichment is also the weakest kind of plausibility, because the pocket is conserved across kinases; without a conservation control it cannot be read as</w:t>
-      </w:r>
-      <w:r>
-        <w:t xml:space="preserve"> </w:t>
-      </w:r>
-      <w:r>
-        <w:t xml:space="preserve">learned chemistry. Two further results bear on reporting: for HyperAttentionDTI the verdict depends on how a multi-channel tensor is reduced to one weight per residue, and our</w:t>
-      </w:r>
-      <w:r>
-        <w:t xml:space="preserve"> </w:t>
-      </w:r>
-      <w:r>
-        <w:t xml:space="preserve">primary readout for MolTrans cannot depend on the drug at all (its interaction map can). Accuracy, finally, is no guide to localisation.</w:t>
+        <w:t xml:space="preserve">The debate over attention as explanation (Jain and Wallace, 2019; Wiegreffe and Pinter, 2019) asked whether attention weights can be read as importance at all. Our</w:t>
+      </w:r>
+      <w:r>
+        <w:t xml:space="preserve"> </w:t>
+      </w:r>
+      <w:r>
+        <w:t xml:space="preserve">faithfulness results side with the view that they can carry importance, and our plausibility results show that importance and biological correctness are separate</w:t>
+      </w:r>
+      <w:r>
+        <w:t xml:space="preserve"> </w:t>
+      </w:r>
+      <w:r>
+        <w:t xml:space="preserve">questions. The drug-dependence check plays the role that model-randomisation tests play for saliency maps (Adebayo et al., 2018): an explanation that does not change</w:t>
+      </w:r>
+      <w:r>
+        <w:t xml:space="preserve"> </w:t>
+      </w:r>
+      <w:r>
+        <w:t xml:space="preserve">when the input that should matter changes cannot explain that input. On benchmarks, DAVIS’s omission of mutant-kinase modifications (Wu et al., 2025, preprint) and the</w:t>
+      </w:r>
+      <w:r>
+        <w:t xml:space="preserve"> </w:t>
+      </w:r>
+      <w:r>
+        <w:t xml:space="preserve">leakage that permissive kinase splits can reward (Ong et al., 2023, preprint) have precedent; we add a measured effect on DeepDTA’s cold-start accuracy, separated from the loss</w:t>
+      </w:r>
+      <w:r>
+        <w:t xml:space="preserve"> </w:t>
+      </w:r>
+      <w:r>
+        <w:t xml:space="preserve">of training data.</w:t>
       </w:r>
     </w:p>
     <w:bookmarkEnd w:id="39"/>
-    <w:bookmarkStart w:id="40" w:name="relation-to-prior-work"/>
+    <w:bookmarkStart w:id="40" w:name="recommendations"/>
     <w:p>
       <w:pPr>
         <w:pStyle w:val="Heading2"/>
       </w:pPr>
       <w:r>
-        <w:t xml:space="preserve">4.2 Relation to prior work</w:t>
+        <w:t xml:space="preserve">4.3 Recommendations</w:t>
       </w:r>
     </w:p>
     <w:p>
@@ -2316,145 +2266,41 @@
         <w:pStyle w:val="FirstParagraph"/>
       </w:pPr>
       <w:r>
-        <w:t xml:space="preserve">Attention has been compared with binding-site annotations in DTI before. MONN (Li et al., 2020) reported that attention-based models, without extra supervision, did</w:t>
-      </w:r>
-      <w:r>
-        <w:t xml:space="preserve"> </w:t>
-      </w:r>
-      <w:r>
-        <w:t xml:space="preserve">not give satisfactory interpretability; ICAN (Kurata and Tsukiyama, 2022) reported that some cross-attention weights match experimental binding sites with statistical</w:t>
-      </w:r>
-      <w:r>
-        <w:t xml:space="preserve"> </w:t>
-      </w:r>
-      <w:r>
-        <w:t xml:space="preserve">significance on DAVIS; and InteractBind (Meng et al., 2026, preprint) found limited localisation despite strong binding prediction across eight models. Our</w:t>
-      </w:r>
-      <w:r>
-        <w:t xml:space="preserve"> </w:t>
-      </w:r>
-      <w:r>
-        <w:t xml:space="preserve">residue-level results are consistent with the first and third. What we add is that the verdict itself is unstable across retrainings, and a battery that states when a</w:t>
-      </w:r>
-      <w:r>
-        <w:t xml:space="preserve"> </w:t>
-      </w:r>
-      <w:r>
-        <w:t xml:space="preserve">single-model significance claim of the kind ICAN reports can be trusted. Two recent audits approach DTI explanations differently: ISAAC (Tarantino et al., 2026,</w:t>
-      </w:r>
-      <w:r>
-        <w:t xml:space="preserve"> </w:t>
-      </w:r>
-      <w:r>
-        <w:t xml:space="preserve">preprint) probes models with matched mechanistic and spurious interventions and reports scores stable across training seeds, and Vefghi et al. (2026, preprint) combine</w:t>
-      </w:r>
-      <w:r>
-        <w:t xml:space="preserve"> </w:t>
-      </w:r>
-      <w:r>
-        <w:t xml:space="preserve">gradient attributions and occlusion on one model and state that this does not substitute for structural ground truth. Ours is complementary: it scores explanations</w:t>
-      </w:r>
-      <w:r>
-        <w:t xml:space="preserve"> </w:t>
-      </w:r>
-      <w:r>
-        <w:t xml:space="preserve">against structural annotations, and for these models the localisation verdicts lack the seed stability ISAAC reports for its intervention scores; whether the two</w:t>
-      </w:r>
-      <w:r>
-        <w:t xml:space="preserve"> </w:t>
-      </w:r>
-      <w:r>
-        <w:t xml:space="preserve">measures would agree on the same models is untested.</w:t>
-      </w:r>
-    </w:p>
-    <w:p>
-      <w:pPr>
-        <w:pStyle w:val="BodyText"/>
-      </w:pPr>
-      <w:r>
-        <w:t xml:space="preserve">The debate over attention as explanation (Jain and Wallace, 2019; Wiegreffe and Pinter, 2019) asked whether attention weights can be read as importance at all. Our</w:t>
-      </w:r>
-      <w:r>
-        <w:t xml:space="preserve"> </w:t>
-      </w:r>
-      <w:r>
-        <w:t xml:space="preserve">faithfulness results side with the view that they can carry importance, and our plausibility results show that importance and biological correctness are separate</w:t>
-      </w:r>
-      <w:r>
-        <w:t xml:space="preserve"> </w:t>
-      </w:r>
-      <w:r>
-        <w:t xml:space="preserve">questions. The drug-dependence check plays the role that model-randomisation tests play for saliency maps (Adebayo et al., 2018): an explanation that does not change</w:t>
-      </w:r>
-      <w:r>
-        <w:t xml:space="preserve"> </w:t>
-      </w:r>
-      <w:r>
-        <w:t xml:space="preserve">when the input that should matter changes cannot explain that input. On benchmarks, DAVIS’s omission of mutant-kinase modifications (Wu et al., 2025, preprint) and the</w:t>
-      </w:r>
-      <w:r>
-        <w:t xml:space="preserve"> </w:t>
-      </w:r>
-      <w:r>
-        <w:t xml:space="preserve">leakage that permissive kinase splits can reward (Ong et al., 2023, preprint) have precedent; we add a measured effect on DeepDTA’s cold-start accuracy, separated from the loss</w:t>
-      </w:r>
-      <w:r>
-        <w:t xml:space="preserve"> </w:t>
-      </w:r>
-      <w:r>
-        <w:t xml:space="preserve">of training data.</w:t>
+        <w:t xml:space="preserve">The following follow directly from these results (Box 1). (i) Report an explanation from several training runs, with the agreement between them and intervals that resample</w:t>
+      </w:r>
+      <w:r>
+        <w:t xml:space="preserve"> </w:t>
+      </w:r>
+      <w:r>
+        <w:t xml:space="preserve">runs as well as proteins. (ii) Read every hit rate against the protein’s chance level and the ground truth’s ceiling, with a uniform-map floor and a positive control that</w:t>
+      </w:r>
+      <w:r>
+        <w:t xml:space="preserve"> </w:t>
+      </w:r>
+      <w:r>
+        <w:t xml:space="preserve">states the smallest detectable effect. (iii) Correct for multiple comparisons across the family of cells shown. (iv) State the readout: which heads, layers, channels and pooling</w:t>
+      </w:r>
+      <w:r>
+        <w:t xml:space="preserve"> </w:t>
+      </w:r>
+      <w:r>
+        <w:t xml:space="preserve">produce one weight per residue, and which inputs it is a function of. (v) Test faithfulness with a masking control of the same size in the model’s own token space.</w:t>
+      </w:r>
+      <w:r>
+        <w:t xml:space="preserve"> </w:t>
+      </w:r>
+      <w:r>
+        <w:t xml:space="preserve">(vi) Check cold-start splits for sequence identity, not identifier identity. The first and third would most change the conclusions of a single-model report,</w:t>
+      </w:r>
+      <w:r>
+        <w:t xml:space="preserve"> </w:t>
+      </w:r>
+      <w:r>
+        <w:t xml:space="preserve">and both are cheap relative to training.</w:t>
       </w:r>
     </w:p>
     <w:bookmarkEnd w:id="40"/>
-    <w:bookmarkStart w:id="41" w:name="recommendations"/>
-    <w:p>
-      <w:pPr>
-        <w:pStyle w:val="Heading2"/>
-      </w:pPr>
-      <w:r>
-        <w:t xml:space="preserve">4.3 Recommendations</w:t>
-      </w:r>
-    </w:p>
-    <w:p>
-      <w:pPr>
-        <w:pStyle w:val="FirstParagraph"/>
-      </w:pPr>
-      <w:r>
-        <w:t xml:space="preserve">The following follow directly from these results (Box 1). (i) Report an explanation from several training runs, with the agreement between them and intervals that resample</w:t>
-      </w:r>
-      <w:r>
-        <w:t xml:space="preserve"> </w:t>
-      </w:r>
-      <w:r>
-        <w:t xml:space="preserve">runs as well as proteins. (ii) Read every hit rate against the protein’s chance level and the ground truth’s ceiling, with a uniform-map floor and a positive control that</w:t>
-      </w:r>
-      <w:r>
-        <w:t xml:space="preserve"> </w:t>
-      </w:r>
-      <w:r>
-        <w:t xml:space="preserve">states the smallest detectable effect. (iii) Correct for multiple comparisons across the family of cells shown. (iv) State the readout: which heads, layers, channels and pooling</w:t>
-      </w:r>
-      <w:r>
-        <w:t xml:space="preserve"> </w:t>
-      </w:r>
-      <w:r>
-        <w:t xml:space="preserve">produce one weight per residue, and which inputs it is a function of. (v) Test faithfulness with a masking control of the same size in the model’s own token space.</w:t>
-      </w:r>
-      <w:r>
-        <w:t xml:space="preserve"> </w:t>
-      </w:r>
-      <w:r>
-        <w:t xml:space="preserve">(vi) Check cold-start splits for sequence identity, not identifier identity. The first and third would most change the conclusions of a single-model report,</w:t>
-      </w:r>
-      <w:r>
-        <w:t xml:space="preserve"> </w:t>
-      </w:r>
-      <w:r>
-        <w:t xml:space="preserve">and both are cheap relative to training.</w:t>
-      </w:r>
-    </w:p>
-    <w:bookmarkEnd w:id="41"/>
-    <w:bookmarkStart w:id="42" w:name="limitations"/>
+    <w:bookmarkStart w:id="41" w:name="limitations"/>
     <w:p>
       <w:pPr>
         <w:pStyle w:val="Heading2"/>
@@ -2623,44 +2469,44 @@
         <w:t xml:space="preserve">cannot be undone without retraining. XAttn-Ref is the authors’ own model; it was trained and scored identically, and its unfavourable results, including chance-level residue localisation, are reported.</w:t>
       </w:r>
     </w:p>
+    <w:bookmarkEnd w:id="41"/>
+    <w:bookmarkStart w:id="42" w:name="conclusion"/>
+    <w:p>
+      <w:pPr>
+        <w:pStyle w:val="Heading2"/>
+      </w:pPr>
+      <w:r>
+        <w:t xml:space="preserve">4.5 Conclusion</w:t>
+      </w:r>
+    </w:p>
+    <w:p>
+      <w:pPr>
+        <w:pStyle w:val="FirstParagraph"/>
+      </w:pPr>
+      <w:r>
+        <w:t xml:space="preserve">For the four attention-based DTI models audited here, a single-seed attention figure cannot carry a residue-level binding-site claim: the verdict changes between retrainings, rarely survives a</w:t>
+      </w:r>
+      <w:r>
+        <w:t xml:space="preserve"> </w:t>
+      </w:r>
+      <w:r>
+        <w:t xml:space="preserve">calibrated test, and depends on the readout. What these maps show reliably is coarser: they are load-bearing for three of the four models and, for two, concentrated in the kinase</w:t>
+      </w:r>
+      <w:r>
+        <w:t xml:space="preserve"> </w:t>
+      </w:r>
+      <w:r>
+        <w:t xml:space="preserve">pocket at most DAVIS levels. Explanation claims in DTI should be reported across runs, against chance and a positive control, with correction and a stated readout, on splits checked for sequence</w:t>
+      </w:r>
+      <w:r>
+        <w:t xml:space="preserve"> </w:t>
+      </w:r>
+      <w:r>
+        <w:t xml:space="preserve">identity.</w:t>
+      </w:r>
+    </w:p>
     <w:bookmarkEnd w:id="42"/>
-    <w:bookmarkStart w:id="43" w:name="conclusion"/>
-    <w:p>
-      <w:pPr>
-        <w:pStyle w:val="Heading2"/>
-      </w:pPr>
-      <w:r>
-        <w:t xml:space="preserve">4.5 Conclusion</w:t>
-      </w:r>
-    </w:p>
-    <w:p>
-      <w:pPr>
-        <w:pStyle w:val="FirstParagraph"/>
-      </w:pPr>
-      <w:r>
-        <w:t xml:space="preserve">For the four attention-based DTI models audited here, a single-seed attention figure cannot carry a residue-level binding-site claim: the verdict changes between retrainings, rarely survives a</w:t>
-      </w:r>
-      <w:r>
-        <w:t xml:space="preserve"> </w:t>
-      </w:r>
-      <w:r>
-        <w:t xml:space="preserve">calibrated test, and depends on the readout. What these maps show reliably is coarser: they are load-bearing for three of the four models and, for two, concentrated in the kinase</w:t>
-      </w:r>
-      <w:r>
-        <w:t xml:space="preserve"> </w:t>
-      </w:r>
-      <w:r>
-        <w:t xml:space="preserve">pocket at most DAVIS levels. Explanation claims in DTI should be reported across runs, against chance and a positive control, with correction and a stated readout, on splits checked for sequence</w:t>
-      </w:r>
-      <w:r>
-        <w:t xml:space="preserve"> </w:t>
-      </w:r>
-      <w:r>
-        <w:t xml:space="preserve">identity.</w:t>
-      </w:r>
-    </w:p>
-    <w:bookmarkEnd w:id="43"/>
-    <w:bookmarkStart w:id="44" w:name="X2146f64485659caf194eecf1d94c916695dbfe5"/>
+    <w:bookmarkStart w:id="43" w:name="X2146f64485659caf194eecf1d94c916695dbfe5"/>
     <w:p>
       <w:pPr>
         <w:pStyle w:val="Heading2"/>
@@ -2757,9 +2603,9 @@
         <w:t xml:space="preserve">[to be completed by the author]</w:t>
       </w:r>
     </w:p>
+    <w:bookmarkEnd w:id="43"/>
     <w:bookmarkEnd w:id="44"/>
-    <w:bookmarkEnd w:id="45"/>
-    <w:bookmarkStart w:id="46" w:name="references-v3-working-list"/>
+    <w:bookmarkStart w:id="45" w:name="references-v3-working-list"/>
     <w:p>
       <w:pPr>
         <w:pStyle w:val="Heading1"/>
@@ -3118,7 +2964,7 @@
         <w:t xml:space="preserve">Zhao, Q., Zhao, H., Zheng, K., Wang, J. (2022) HyperAttentionDTI: improving drug–protein interaction prediction by sequence-based deep learning with attention mechanism. Bioinformatics 38, 655-662. doi:10.1093/bioinformatics/btab715</w:t>
       </w:r>
     </w:p>
-    <w:bookmarkEnd w:id="46"/>
+    <w:bookmarkEnd w:id="45"/>
     <w:sectPr>
       <w:footnotePr>
         <w:numRestart w:val="eachSect"/>

</xml_diff>

<commit_message>
Fix Overleaf build: load graphicx; restore section 2.3 lost by comment stripping; add a lost-paragraph guard
The pandoc template only loads graphicx when pandoc sees an image, but the figures are raw LaTeX: the first compile failed at the first figure.
A lazy comment-stripping pattern swallowed section 2.3 (and two citations) from the clean markdown, Word and LaTeX copies; the pattern is fixed and
the build now fails if any source paragraph is missing from the clean copies.

Co-Authored-By: Claude Sonnet 5.5 <noreply@anthropic.com>
</commit_message>
<xml_diff>
--- a/paper/v3_ismb/MANUSCRIPT.docx
+++ b/paper/v3_ismb/MANUSCRIPT.docx
@@ -661,7 +661,7 @@
       </w:r>
     </w:p>
     <w:bookmarkEnd w:id="11"/>
-    <w:bookmarkStart w:id="18" w:name="methods"/>
+    <w:bookmarkStart w:id="19" w:name="methods"/>
     <w:p>
       <w:pPr>
         <w:pStyle w:val="Heading1"/>
@@ -830,6 +830,106 @@
         <w:t xml:space="preserve"> </w:t>
       </w:r>
       <w:r>
+        <w:t xml:space="preserve">DrugBAN is</w:t>
+      </w:r>
+      <w:r>
+        <w:t xml:space="preserve"> </w:t>
+      </w:r>
+      <w:r>
+        <w:t xml:space="preserve">trained on DAVIS only. Training ran on Kaggle sessions with two NVIDIA T4 GPUs, one independent job per GPU.</w:t>
+      </w:r>
+    </w:p>
+    <w:p>
+      <w:pPr>
+        <w:pStyle w:val="BodyText"/>
+      </w:pPr>
+      <w:r>
+        <w:t xml:space="preserve">The explanation scored for each model is the readout of the primary analysis: MolTrans’s protein-encoder self-attention</w:t>
+      </w:r>
+      <w:r>
+        <w:t xml:space="preserve"> </w:t>
+      </w:r>
+      <w:r>
+        <w:t xml:space="preserve">(last layer, mean over heads), HyperAttentionDTI’s channel-mean attention placed at the centre of each convolution window, DrugBAN’s bilinear</w:t>
+      </w:r>
+      <w:r>
+        <w:t xml:space="preserve"> </w:t>
+      </w:r>
+      <w:r>
+        <w:t xml:space="preserve">attention summed over drug atoms and averaged over heads, and XAttn-Ref’s cross-attention weights; each is projected to one non-negative weight per</w:t>
+      </w:r>
+      <w:r>
+        <w:t xml:space="preserve"> </w:t>
+      </w:r>
+      <w:r>
+        <w:t xml:space="preserve">residue. Whether each primary readout matches the map its authors display has not been confirmed against their figures; alternative readouts are</w:t>
+      </w:r>
+      <w:r>
+        <w:t xml:space="preserve"> </w:t>
+      </w:r>
+      <w:r>
+        <w:t xml:space="preserve">a sensitivity analysis (Supplement).</w:t>
+      </w:r>
+    </w:p>
+    <w:bookmarkEnd w:id="13"/>
+    <w:bookmarkStart w:id="14" w:name="ground-truths-and-plausibility"/>
+    <w:p>
+      <w:pPr>
+        <w:pStyle w:val="Heading2"/>
+      </w:pPr>
+      <w:r>
+        <w:t xml:space="preserve">2.3 Ground truths and plausibility</w:t>
+      </w:r>
+    </w:p>
+    <w:p>
+      <w:pPr>
+        <w:pStyle w:val="FirstParagraph"/>
+      </w:pPr>
+      <w:r>
+        <w:t xml:space="preserve">Two ground truths at different resolutions are used.</w:t>
+      </w:r>
+      <w:r>
+        <w:t xml:space="preserve"> </w:t>
+      </w:r>
+      <w:r>
+        <w:rPr>
+          <w:b/>
+          <w:bCs/>
+        </w:rPr>
+        <w:t xml:space="preserve">UniProt residues</w:t>
+      </w:r>
+      <w:r>
+        <w:t xml:space="preserve">: sequence features of type Binding site, Active site and Nucleotide</w:t>
+      </w:r>
+      <w:r>
+        <w:t xml:space="preserve"> </w:t>
+      </w:r>
+      <w:r>
+        <w:t xml:space="preserve">binding (The UniProt Consortium, 2025), re-numbered onto each dataset sequence by alignment so that a site points at the residue the model read.</w:t>
+      </w:r>
+      <w:r>
+        <w:t xml:space="preserve"> </w:t>
+      </w:r>
+      <w:r>
+        <w:rPr>
+          <w:b/>
+          <w:bCs/>
+        </w:rPr>
+        <w:t xml:space="preserve">KLIFS pocket</w:t>
+      </w:r>
+      <w:r>
+        <w:t xml:space="preserve">: the 85 residues lining the ATP cleft of every kinase (van Linden et al., 2014; Kanev et al., 2021), placed on each sequence by the</w:t>
+      </w:r>
+      <w:r>
+        <w:t xml:space="preserve"> </w:t>
+      </w:r>
+      <w:r>
+        <w:t xml:space="preserve">same alignment. Proteins are scored within their first 1,000 residues.</w:t>
+      </w:r>
+      <w:r>
+        <w:t xml:space="preserve"> </w:t>
+      </w:r>
+      <w:r>
         <w:t xml:space="preserve">Plausibility is precision@k, the fraction of a protein’s k most-attended residues that are sites, with k = 10 fixed before any result existed. It is</w:t>
       </w:r>
       <w:r>
@@ -845,8 +945,8 @@
         <w:t xml:space="preserve">(sites in the window) ÷ (window length), the exact expectation for k uniformly random residues, and its ceiling is min(sites, k) ÷ k.</w:t>
       </w:r>
     </w:p>
-    <w:bookmarkEnd w:id="13"/>
-    <w:bookmarkStart w:id="14" w:name="the-calibrated-battery"/>
+    <w:bookmarkEnd w:id="14"/>
+    <w:bookmarkStart w:id="15" w:name="the-calibrated-battery"/>
     <w:p>
       <w:pPr>
         <w:pStyle w:val="Heading2"/>
@@ -1084,8 +1184,8 @@
         <w:t xml:space="preserve">the same intervention.</w:t>
       </w:r>
     </w:p>
-    <w:bookmarkEnd w:id="14"/>
-    <w:bookmarkStart w:id="15" w:name="seed-instability-and-effect-sizes"/>
+    <w:bookmarkEnd w:id="15"/>
+    <w:bookmarkStart w:id="16" w:name="seed-instability-and-effect-sizes"/>
     <w:p>
       <w:pPr>
         <w:pStyle w:val="Heading2"/>
@@ -1196,8 +1296,8 @@
         <w:t xml:space="preserve">Spearman’s ρ across cells with a bootstrap interval; it is a description, not a test.</w:t>
       </w:r>
     </w:p>
-    <w:bookmarkEnd w:id="15"/>
-    <w:bookmarkStart w:id="16" w:name="quantifying-the-davis-leak"/>
+    <w:bookmarkEnd w:id="16"/>
+    <w:bookmarkStart w:id="17" w:name="quantifying-the-davis-leak"/>
     <w:p>
       <w:pPr>
         <w:pStyle w:val="Heading2"/>
@@ -1226,8 +1326,8 @@
         <w:t xml:space="preserve">two, per seed and on the same test set, is the leak; the difference between the original and the matched set is the cost of the smaller training set.</w:t>
       </w:r>
     </w:p>
-    <w:bookmarkEnd w:id="16"/>
-    <w:bookmarkStart w:id="17" w:name="reproducibility"/>
+    <w:bookmarkEnd w:id="17"/>
+    <w:bookmarkStart w:id="18" w:name="reproducibility"/>
     <w:p>
       <w:pPr>
         <w:pStyle w:val="Heading2"/>
@@ -1250,9 +1350,9 @@
         <w:t xml:space="preserve">and every number in this manuscript carries a machine-checked source tag. Code and outputs: see Availability.</w:t>
       </w:r>
     </w:p>
-    <w:bookmarkEnd w:id="17"/>
     <w:bookmarkEnd w:id="18"/>
-    <w:bookmarkStart w:id="37" w:name="results"/>
+    <w:bookmarkEnd w:id="19"/>
+    <w:bookmarkStart w:id="38" w:name="results"/>
     <w:p>
       <w:pPr>
         <w:pStyle w:val="Heading1"/>
@@ -1261,7 +1361,7 @@
         <w:t xml:space="preserve">3 Results</w:t>
       </w:r>
     </w:p>
-    <w:bookmarkStart w:id="19" w:name="accuracy-of-the-retrained-models"/>
+    <w:bookmarkStart w:id="20" w:name="accuracy-of-the-retrained-models"/>
     <w:p>
       <w:pPr>
         <w:pStyle w:val="Heading2"/>
@@ -1296,8 +1396,8 @@
         <w:t xml:space="preserve">attention), and the seed-to-seed standard deviation grows with it: 0.001–0.006 at the random level against 0.025–0.099 at cold-pair.</w:t>
       </w:r>
     </w:p>
-    <w:bookmarkEnd w:id="19"/>
-    <w:bookmarkStart w:id="23" w:name="X37396230811e488263ffbc0b6db8eb522da5085"/>
+    <w:bookmarkEnd w:id="20"/>
+    <w:bookmarkStart w:id="24" w:name="X37396230811e488263ffbc0b6db8eb522da5085"/>
     <w:p>
       <w:pPr>
         <w:pStyle w:val="Heading2"/>
@@ -1407,18 +1507,18 @@
           <wp:inline>
             <wp:extent cx="5334000" cy="3038448"/>
             <wp:effectExtent b="0" l="0" r="0" t="0"/>
-            <wp:docPr descr="Figure 1" title="" id="21" name="Picture"/>
+            <wp:docPr descr="Figure 1" title="" id="22" name="Picture"/>
             <a:graphic>
               <a:graphicData uri="http://schemas.openxmlformats.org/drawingml/2006/picture">
                 <pic:pic>
                   <pic:nvPicPr>
-                    <pic:cNvPr descr="../v2/figures/fig1_seed_instability.png" id="22" name="Picture"/>
+                    <pic:cNvPr descr="../v2/figures/fig1_seed_instability.png" id="23" name="Picture"/>
                     <pic:cNvPicPr>
                       <a:picLocks noChangeArrowheads="1" noChangeAspect="1"/>
                     </pic:cNvPicPr>
                   </pic:nvPicPr>
                   <pic:blipFill>
-                    <a:blip r:embed="rId20"/>
+                    <a:blip r:embed="rId21"/>
                     <a:stretch>
                       <a:fillRect/>
                     </a:stretch>
@@ -1471,8 +1571,8 @@
         <w:t xml:space="preserve">Precision@10 of each training seed (points) on DAVIS at four levels of shift, against UniProt residues (top) and the KLIFS 85-residue pocket (bottom). Black bar: mean of the three seeds; dashed tick: that level’s exact chance level. Seeds of one recipe that fall on both sides of chance are the instability reported here. The y-axes differ between panels.</w:t>
       </w:r>
     </w:p>
-    <w:bookmarkEnd w:id="23"/>
-    <w:bookmarkStart w:id="24" w:name="X4973426553b2ce0c1500220fabf36dcaa133b8e"/>
+    <w:bookmarkEnd w:id="24"/>
+    <w:bookmarkStart w:id="25" w:name="X4973426553b2ce0c1500220fabf36dcaa133b8e"/>
     <w:p>
       <w:pPr>
         <w:pStyle w:val="Heading2"/>
@@ -1537,8 +1637,8 @@
         <w:t xml:space="preserve">[0.70, 2.70], and its split-level test does not survive (p = 0.07279 against a threshold of 0.00625).</w:t>
       </w:r>
     </w:p>
-    <w:bookmarkEnd w:id="24"/>
-    <w:bookmarkStart w:id="31" w:name="X69c0f5d6bc53b4dd991174c145fa2b1c60f39e5"/>
+    <w:bookmarkEnd w:id="25"/>
+    <w:bookmarkStart w:id="32" w:name="X69c0f5d6bc53b4dd991174c145fa2b1c60f39e5"/>
     <w:p>
       <w:pPr>
         <w:pStyle w:val="Heading2"/>
@@ -1662,18 +1762,18 @@
           <wp:inline>
             <wp:extent cx="5334000" cy="4752109"/>
             <wp:effectExtent b="0" l="0" r="0" t="0"/>
-            <wp:docPr descr="Figure 2" title="" id="26" name="Picture"/>
+            <wp:docPr descr="Figure 2" title="" id="27" name="Picture"/>
             <a:graphic>
               <a:graphicData uri="http://schemas.openxmlformats.org/drawingml/2006/picture">
                 <pic:pic>
                   <pic:nvPicPr>
-                    <pic:cNvPr descr="../v2/figures/fig2_enrichment_forest.png" id="27" name="Picture"/>
+                    <pic:cNvPr descr="../v2/figures/fig2_enrichment_forest.png" id="28" name="Picture"/>
                     <pic:cNvPicPr>
                       <a:picLocks noChangeArrowheads="1" noChangeAspect="1"/>
                     </pic:cNvPicPr>
                   </pic:nvPicPr>
                   <pic:blipFill>
-                    <a:blip r:embed="rId25"/>
+                    <a:blip r:embed="rId26"/>
                     <a:stretch>
                       <a:fillRect/>
                     </a:stretch>
@@ -1735,18 +1835,18 @@
           <wp:inline>
             <wp:extent cx="5334000" cy="1878580"/>
             <wp:effectExtent b="0" l="0" r="0" t="0"/>
-            <wp:docPr descr="Figure 3" title="" id="29" name="Picture"/>
+            <wp:docPr descr="Figure 3" title="" id="30" name="Picture"/>
             <a:graphic>
               <a:graphicData uri="http://schemas.openxmlformats.org/drawingml/2006/picture">
                 <pic:pic>
                   <pic:nvPicPr>
-                    <pic:cNvPr descr="../v2/figures/fig5_faithfulness.png" id="30" name="Picture"/>
+                    <pic:cNvPr descr="../v2/figures/fig5_faithfulness.png" id="31" name="Picture"/>
                     <pic:cNvPicPr>
                       <a:picLocks noChangeArrowheads="1" noChangeAspect="1"/>
                     </pic:cNvPicPr>
                   </pic:nvPicPr>
                   <pic:blipFill>
-                    <a:blip r:embed="rId28"/>
+                    <a:blip r:embed="rId29"/>
                     <a:stretch>
                       <a:fillRect/>
                     </a:stretch>
@@ -1799,8 +1899,8 @@
         <w:t xml:space="preserve">Faithfulness delta (attended masking minus a size-matched random-masking control), mean over proteins, with 95% two-way bootstrap intervals (proteins and seeds resampled, 10,000 resamples). MolTrans is measured in its own token space and the others in residue space, so the three panels do not share a scale. DrugBAN is not drawn: its per-seed deltas are reported in the text but carry no interval, because its per-pair values were not recorded. No KIBA cell exists for XAttn-Ref.</w:t>
       </w:r>
     </w:p>
-    <w:bookmarkEnd w:id="31"/>
-    <w:bookmarkStart w:id="32" w:name="X0143d6ba96157ba18dd43b44e2f2b1a6fdf5bc6"/>
+    <w:bookmarkEnd w:id="32"/>
+    <w:bookmarkStart w:id="33" w:name="X0143d6ba96157ba18dd43b44e2f2b1a6fdf5bc6"/>
     <w:p>
       <w:pPr>
         <w:pStyle w:val="Heading2"/>
@@ -1841,8 +1941,8 @@
         <w:t xml:space="preserve">the drug cannot mark that drug’s binding site, whatever its hit rate. MolTrans’s interaction map, a different readout of the same model, does change with the drug (identical top ten in 0% of the same 150 pairs).</w:t>
       </w:r>
     </w:p>
-    <w:bookmarkEnd w:id="32"/>
-    <w:bookmarkStart w:id="36" w:name="daviss-sequence-leakage-quantified"/>
+    <w:bookmarkEnd w:id="33"/>
+    <w:bookmarkStart w:id="37" w:name="daviss-sequence-leakage-quantified"/>
     <w:p>
       <w:pPr>
         <w:pStyle w:val="Heading2"/>
@@ -1904,18 +2004,18 @@
           <wp:inline>
             <wp:extent cx="5334000" cy="2196647"/>
             <wp:effectExtent b="0" l="0" r="0" t="0"/>
-            <wp:docPr descr="Figure 4" title="" id="34" name="Picture"/>
+            <wp:docPr descr="Figure 4" title="" id="35" name="Picture"/>
             <a:graphic>
               <a:graphicData uri="http://schemas.openxmlformats.org/drawingml/2006/picture">
                 <pic:pic>
                   <pic:nvPicPr>
-                    <pic:cNvPr descr="../v2/figures/fig6_leakage.png" id="35" name="Picture"/>
+                    <pic:cNvPr descr="../v2/figures/fig6_leakage.png" id="36" name="Picture"/>
                     <pic:cNvPicPr>
                       <a:picLocks noChangeArrowheads="1" noChangeAspect="1"/>
                     </pic:cNvPicPr>
                   </pic:nvPicPr>
                   <pic:blipFill>
-                    <a:blip r:embed="rId33"/>
+                    <a:blip r:embed="rId34"/>
                     <a:stretch>
                       <a:fillRect/>
                     </a:stretch>
@@ -2057,9 +2157,9 @@
         <w:t xml:space="preserve">Every result in this section concerns kinase targets; the non-kinase transfer panel is not analysed here.</w:t>
       </w:r>
     </w:p>
-    <w:bookmarkEnd w:id="36"/>
     <w:bookmarkEnd w:id="37"/>
-    <w:bookmarkStart w:id="44" w:name="discussion"/>
+    <w:bookmarkEnd w:id="38"/>
+    <w:bookmarkStart w:id="45" w:name="discussion"/>
     <w:p>
       <w:pPr>
         <w:pStyle w:val="Heading1"/>
@@ -2068,7 +2168,7 @@
         <w:t xml:space="preserve">4 Discussion</w:t>
       </w:r>
     </w:p>
-    <w:bookmarkStart w:id="38" w:name="what-the-audit-shows"/>
+    <w:bookmarkStart w:id="39" w:name="what-the-audit-shows"/>
     <w:p>
       <w:pPr>
         <w:pStyle w:val="Heading2"/>
@@ -2147,8 +2247,8 @@
         <w:t xml:space="preserve">primary readout for MolTrans cannot depend on the drug at all (its interaction map can). Accuracy, finally, is no guide to localisation.</w:t>
       </w:r>
     </w:p>
-    <w:bookmarkEnd w:id="38"/>
-    <w:bookmarkStart w:id="39" w:name="relation-to-prior-work"/>
+    <w:bookmarkEnd w:id="39"/>
+    <w:bookmarkStart w:id="40" w:name="relation-to-prior-work"/>
     <w:p>
       <w:pPr>
         <w:pStyle w:val="Heading2"/>
@@ -2251,8 +2351,8 @@
         <w:t xml:space="preserve">of training data.</w:t>
       </w:r>
     </w:p>
-    <w:bookmarkEnd w:id="39"/>
-    <w:bookmarkStart w:id="40" w:name="recommendations"/>
+    <w:bookmarkEnd w:id="40"/>
+    <w:bookmarkStart w:id="41" w:name="recommendations"/>
     <w:p>
       <w:pPr>
         <w:pStyle w:val="Heading2"/>
@@ -2299,8 +2399,8 @@
         <w:t xml:space="preserve">and both are cheap relative to training.</w:t>
       </w:r>
     </w:p>
-    <w:bookmarkEnd w:id="40"/>
-    <w:bookmarkStart w:id="41" w:name="limitations"/>
+    <w:bookmarkEnd w:id="41"/>
+    <w:bookmarkStart w:id="42" w:name="limitations"/>
     <w:p>
       <w:pPr>
         <w:pStyle w:val="Heading2"/>
@@ -2469,8 +2569,8 @@
         <w:t xml:space="preserve">cannot be undone without retraining. XAttn-Ref is the authors’ own model; it was trained and scored identically, and its unfavourable results, including chance-level residue localisation, are reported.</w:t>
       </w:r>
     </w:p>
-    <w:bookmarkEnd w:id="41"/>
-    <w:bookmarkStart w:id="42" w:name="conclusion"/>
+    <w:bookmarkEnd w:id="42"/>
+    <w:bookmarkStart w:id="43" w:name="conclusion"/>
     <w:p>
       <w:pPr>
         <w:pStyle w:val="Heading2"/>
@@ -2505,8 +2605,8 @@
         <w:t xml:space="preserve">identity.</w:t>
       </w:r>
     </w:p>
-    <w:bookmarkEnd w:id="42"/>
-    <w:bookmarkStart w:id="43" w:name="X2146f64485659caf194eecf1d94c916695dbfe5"/>
+    <w:bookmarkEnd w:id="43"/>
+    <w:bookmarkStart w:id="44" w:name="X2146f64485659caf194eecf1d94c916695dbfe5"/>
     <w:p>
       <w:pPr>
         <w:pStyle w:val="Heading2"/>
@@ -2603,9 +2703,9 @@
         <w:t xml:space="preserve">[to be completed by the author]</w:t>
       </w:r>
     </w:p>
-    <w:bookmarkEnd w:id="43"/>
     <w:bookmarkEnd w:id="44"/>
-    <w:bookmarkStart w:id="45" w:name="references-v3-working-list"/>
+    <w:bookmarkEnd w:id="45"/>
+    <w:bookmarkStart w:id="46" w:name="references-v3-working-list"/>
     <w:p>
       <w:pPr>
         <w:pStyle w:val="Heading1"/>
@@ -2964,7 +3064,7 @@
         <w:t xml:space="preserve">Zhao, Q., Zhao, H., Zheng, K., Wang, J. (2022) HyperAttentionDTI: improving drug–protein interaction prediction by sequence-based deep learning with attention mechanism. Bioinformatics 38, 655-662. doi:10.1093/bioinformatics/btab715</w:t>
       </w:r>
     </w:p>
-    <w:bookmarkEnd w:id="45"/>
+    <w:bookmarkEnd w:id="46"/>
     <w:sectPr>
       <w:footnotePr>
         <w:numRestart w:val="eachSect"/>

</xml_diff>

<commit_message>
Supplement: per-cell seed-agreement table (S6) and enrichment-with-intervals table (S7), generated and source-tagged
S6 lists all 22 UniProt cells (per-seed precision@10, chance, exact per-seed p, audit median p, Holm decision); S7 lists all 44 cells behind Figure 2.
Both are generated by scripts/build_v3_supplement_tables.py from committed result files and reproduce the paper's headline counts
(11 of 22 disagree, 1 Holm survivor). Main text and Figure 2 caption point to them.

Co-Authored-By: Claude Sonnet 5.5 <noreply@anthropic.com>
</commit_message>
<xml_diff>
--- a/paper/v3_ismb/MANUSCRIPT.docx
+++ b/paper/v3_ismb/MANUSCRIPT.docx
@@ -1423,7 +1423,7 @@
         <w:t xml:space="preserve"> </w:t>
       </w:r>
       <w:r>
-        <w:t xml:space="preserve">on DAVIS, 3 of 6 on KIBA). Only 1 cell has all three seeds above the threshold; 10 have none (Figure 1).</w:t>
+        <w:t xml:space="preserve">on DAVIS, 3 of 6 on KIBA). Only 1 cell has all three seeds above the threshold; 10 have none (Figure 1; per-cell values in Supplementary Table S6).</w:t>
       </w:r>
       <w:r>
         <w:t xml:space="preserve"> </w:t>
@@ -1823,7 +1823,7 @@
         <w:t xml:space="preserve"> </w:t>
       </w:r>
       <w:r>
-        <w:t xml:space="preserve">Precision@10 divided by chance for every model and level, DAVIS (top) and KIBA (bottom), against UniProt residues (left) and the KLIFS pocket (right). Intervals are 95% percentile intervals from a two-way bootstrap that resamples both proteins and seeds (10,000 resamples); log scale; the dashed line is chance (an enrichment of one). Pocket-level enrichment is not controlled for residue conservation.</w:t>
+        <w:t xml:space="preserve">Precision@10 divided by chance for every model and level, DAVIS (top) and KIBA (bottom), against UniProt residues (left) and the KLIFS pocket (right). Intervals are 95% percentile intervals from a two-way bootstrap that resamples both proteins and seeds (10,000 resamples); log scale; the dashed line is chance (an enrichment of one). Pocket-level enrichment is not controlled for residue conservation. Exact values are in Supplementary Table S7.</w:t>
       </w:r>
     </w:p>
     <w:p>

</xml_diff>

<commit_message>
Canary and epoch-1 gate PASS under the declared rules (attempt 3, 2026-10-17); harness hash 52bd3335
Canary: test AUROC 0.8705, AUPRC 0.5005 within 4 committed-seed SDs of the committed cell. Official epoch-1 gate (gate_rule_v2, Gate A 4 SDs): pass; the original rule fails the same
runs (Gate A, and seed 4 as in attempt 2). The run used torch 2.11.0+cu128, not 2.10.0 as attempts 1 and 2: recorded in docs/canary_attempts. Third same-seed rerun added to the
paper's limitation and the supplement log (AUROC 0.8868, 0.8494, 0.8705 vs committed 0.8501).

Co-Authored-By: Claude Sonnet 5.5 <noreply@anthropic.com>
</commit_message>
<xml_diff>
--- a/paper/v3_ismb/MANUSCRIPT.docx
+++ b/paper/v3_ismb/MANUSCRIPT.docx
@@ -2458,19 +2458,19 @@
         <w:t xml:space="preserve"> </w:t>
       </w:r>
       <w:r>
-        <w:t xml:space="preserve">committed cell (XAttn-Ref, DAVIS cold-target, seed 1) twice with identical initial weights, the same library version and GPU type: test AUROC came out at 0.8868 in one attempt and</w:t>
-      </w:r>
-      <w:r>
-        <w:t xml:space="preserve"> </w:t>
-      </w:r>
-      <w:r>
-        <w:t xml:space="preserve">0.8494 in the other, against the committed 0.8501. The two attempts ran different versions of the harness code but the same training code (docs/canary_attempts/README.md), so this is</w:t>
-      </w:r>
-      <w:r>
-        <w:t xml:space="preserve"> </w:t>
-      </w:r>
-      <w:r>
-        <w:t xml:space="preserve">one pair of runs and not a variance estimate; it does show that fixing the seed does not fix the outcome. Our claim is therefore that verdicts differ between retrainings, which is</w:t>
+        <w:t xml:space="preserve">committed cell (XAttn-Ref, DAVIS cold-target, seed 1) three times with identical initial weights and the same GPU type: test AUROC came out at 0.8868, 0.8494 and 0.8705, against the committed 0.8501.</w:t>
+      </w:r>
+      <w:r>
+        <w:t xml:space="preserve"> </w:t>
+      </w:r>
+      <w:r>
+        <w:t xml:space="preserve">The first two attempts used the same library version and different versions of the harness code but the same training code; the third used a newer library version (docs/canary_attempts/README.md). This is</w:t>
+      </w:r>
+      <w:r>
+        <w:t xml:space="preserve"> </w:t>
+      </w:r>
+      <w:r>
+        <w:t xml:space="preserve">three reruns of one cell and not a variance estimate; it does show that fixing the seed does not fix the outcome. Our claim is therefore that verdicts differ between retrainings, which is</w:t>
       </w:r>
       <w:r>
         <w:t xml:space="preserve"> </w:t>

</xml_diff>